<commit_message>
Revise manuscript to preserve original voice/phrasing; rewrite Inkscape guide as step-by-step checklist
</commit_message>
<xml_diff>
--- a/paper/manuscript.docx
+++ b/paper/manuscript.docx
@@ -2,7 +2,7 @@
 <file path=word/document.xml><?xml version="1.0" encoding="utf-8"?>
 <w:document xmlns:w="http://schemas.openxmlformats.org/wordprocessingml/2006/main" xmlns:m="http://schemas.openxmlformats.org/officeDocument/2006/math" xmlns:r="http://schemas.openxmlformats.org/officeDocument/2006/relationships" xmlns:o="urn:schemas-microsoft-com:office:office" xmlns:v="urn:schemas-microsoft-com:vml" xmlns:w10="urn:schemas-microsoft-com:office:word" xmlns:a="http://schemas.openxmlformats.org/drawingml/2006/main" xmlns:pic="http://schemas.openxmlformats.org/drawingml/2006/picture" xmlns:wp="http://schemas.openxmlformats.org/drawingml/2006/wordprocessingDrawing">
   <w:body>
-    <w:bookmarkStart w:id="56" w:name="Xabef83d54ffa0a15b8560ab4e0076cedb4822aa"/>
+    <w:bookmarkStart w:id="55" w:name="Xabef83d54ffa0a15b8560ab4e0076cedb4822aa"/>
     <w:p>
       <w:pPr>
         <w:pStyle w:val="Heading1"/>
@@ -99,7 +99,7 @@
         <w:pStyle w:val="FirstParagraph"/>
       </w:pPr>
       <w:r>
-        <w:t xml:space="preserve">Stroke, caused by the disruption of blood flow to the brain, affects more than 13 million people worldwide, kills more than 5 million annually, and is a major cause of long-term disability</w:t>
+        <w:t xml:space="preserve">Stroke, which is caused by the disruption of blood flow to the brain, affects more than 13 million people worldwide, kills more than 5 million annually, and is a major cause of disability</w:t>
       </w:r>
       <w:r>
         <w:t xml:space="preserve"> </w:t>
@@ -108,7 +108,7 @@
         <w:t xml:space="preserve">(Lu et al. 2012; Kuriakose and Xiao 2020)</w:t>
       </w:r>
       <w:r>
-        <w:t xml:space="preserve">. Motor deficits are one of the most consequential neurological outcomes of stroke, leading to a loss of independence and reduced quality of life</w:t>
+        <w:t xml:space="preserve">. Motor deficits are one major neurological consequence of stroke, leading to a loss of independence and lower quality of life</w:t>
       </w:r>
       <w:r>
         <w:t xml:space="preserve"> </w:t>
@@ -117,7 +117,7 @@
         <w:t xml:space="preserve">(Lucchetti et al. 2025)</w:t>
       </w:r>
       <w:r>
-        <w:t xml:space="preserve">. Physical impairments in stroke survivors must be properly diagnosed — including changes in the affected limb’s physical function — before appropriate remediation can be recommended</w:t>
+        <w:t xml:space="preserve">. The physical impairments associated with stroke survivors need to be properly diagnosed, including changes in physical function of the affected limb, and the recommendation of appropriate remediation</w:t>
       </w:r>
       <w:r>
         <w:t xml:space="preserve"> </w:t>
@@ -134,7 +134,7 @@
         <w:pStyle w:val="BodyText"/>
       </w:pPr>
       <w:r>
-        <w:t xml:space="preserve">Shoulder–arm kinematics and muscular synergies are engaged across at least 30 categories of daily-life tasks, and hand postural synergies play a central role in grasp-force generation</w:t>
+        <w:t xml:space="preserve">Shoulder-arm kinematics and muscular synergies involve at least 30 daily-life tasks, and hand postural synergies play a significant role in grasp force</w:t>
       </w:r>
       <w:r>
         <w:t xml:space="preserve"> </w:t>
@@ -143,7 +143,7 @@
         <w:t xml:space="preserve">(Hu et al. 2018; Averta et al. 2018; Saudabayev et al. 2018)</w:t>
       </w:r>
       <w:r>
-        <w:t xml:space="preserve">. Linking forearm muscle activity to hand kinematics is essential for prosthetic design and biomechanical 3-D modelling</w:t>
+        <w:t xml:space="preserve">. Linking forearm muscle activity and hand kinematics is essential for developing prosthetics and 3D modelling</w:t>
       </w:r>
       <w:r>
         <w:t xml:space="preserve"> </w:t>
@@ -160,7 +160,7 @@
         <w:pStyle w:val="BodyText"/>
       </w:pPr>
       <w:r>
-        <w:t xml:space="preserve">In general, compensation strategies adopted by stroke survivors — recruiting alternative pathways, stronger joints, or unaffected muscles — are frequently inefficient and can reinforce maladaptive movement patterns over time</w:t>
+        <w:t xml:space="preserve">In general, compensation strategies for stroke survivors involve using new pathways, strong joints, and muscles, which can be at least ineffective</w:t>
       </w:r>
       <w:r>
         <w:t xml:space="preserve"> </w:t>
@@ -169,7 +169,7 @@
         <w:t xml:space="preserve">(Dolatabadi et al. 2017)</w:t>
       </w:r>
       <w:r>
-        <w:t xml:space="preserve">. Existing rehabilitation devices are also frequently abandoned by their intended users: across assistive-technology categories broadly, abandonment rates are driven by poor fit between device design and the user’s actual needs, insufficient involvement of the user in device selection, and lack of ongoing support after delivery</w:t>
+        <w:t xml:space="preserve">. Existing rehabilitation devices are usually abandoned by users after delivery: abandonment is driven by poor fit between the device and the user’s actual needs, insufficient user involvement in device selection, and lack of ongoing support once the device is in the home</w:t>
       </w:r>
       <w:r>
         <w:t xml:space="preserve"> </w:t>
@@ -178,7 +178,7 @@
         <w:t xml:space="preserve">(Sugawara et al. 2018)</w:t>
       </w:r>
       <w:r>
-        <w:t xml:space="preserve">. Robotic and electromechanical rehabilitation devices are not exempt from this pattern, and their cost and clinic-based delivery model further limit sustained home use</w:t>
+        <w:t xml:space="preserve">. Robotic and electromechanical devices carry the same risk, and their cost and clinic-based delivery model make sustained home use harder</w:t>
       </w:r>
       <w:r>
         <w:t xml:space="preserve"> </w:t>
@@ -187,7 +187,7 @@
         <w:t xml:space="preserve">(Mehrholz et al. 2015)</w:t>
       </w:r>
       <w:r>
-        <w:t xml:space="preserve">. To address this challenge, we argue that any assistive device for upper-limb stroke rehabilitation should be (i) low-cost and open-hardware, so it can be deployed at home and in community clinics rather than only in specialized centres, and (ii) adaptive, so it can flag emerging compensation strategies in real time rather than relying solely on intermittent clinical supervision.</w:t>
+        <w:t xml:space="preserve">. To address this challenge, we argue that an upper-limb rehabilitation device should be low-cost and open-hardware, so it can reach the home and the community clinic rather than only the specialized centre, and it should be adaptive, so it can flag emerging compensation in real time rather than depend only on intermittent clinical supervision.</w:t>
       </w:r>
     </w:p>
     <w:p>
@@ -195,7 +195,7 @@
         <w:pStyle w:val="BodyText"/>
       </w:pPr>
       <w:r>
-        <w:t xml:space="preserve">Supervision matters because unsupervised device use risks survivors recruiting unaffected muscles and joints in ways that produce undesirable long-term outcomes</w:t>
+        <w:t xml:space="preserve">The use of these devices needs to be supervised so that survivors do not recruit unaffected muscles and joints, which often leads to undesirable outcomes</w:t>
       </w:r>
       <w:r>
         <w:t xml:space="preserve"> </w:t>
@@ -204,7 +204,7 @@
         <w:t xml:space="preserve">(Zhi et al. 2018)</w:t>
       </w:r>
       <w:r>
-        <w:t xml:space="preserve">. To characterize these compensations, prior work has used healthy participants to simulate three canonical compensation strategies — forward trunk lean, trunk rotation, and shoulder elevation — while performing standardized reaching tasks, producing the Toronto Rehab Stroke Pose (TRSP) dataset used in this study</w:t>
+        <w:t xml:space="preserve">. To understand these compensations, previous studies have simulated three types of compensation with healthy participants. These compensations include lean forward, trunk rotation, and shoulder elevation compensations</w:t>
       </w:r>
       <w:r>
         <w:t xml:space="preserve"> </w:t>
@@ -213,7 +213,7 @@
         <w:t xml:space="preserve">(Zhi et al. 2018; Dolatabadi et al. 2017)</w:t>
       </w:r>
       <w:r>
-        <w:t xml:space="preserve">. However, when post-stroke survivors are given home-based rehabilitation programs without this kind of structured supervision, new and undesirable compensation patterns risk emerging, making later unlearning and relearning necessary</w:t>
+        <w:t xml:space="preserve">. However, when post-stroke survivors are given homework-based rehabilitation programs, new and undesirable compensation paths risk being developed, making unlearning and relearning necessary</w:t>
       </w:r>
       <w:r>
         <w:t xml:space="preserve"> </w:t>
@@ -222,7 +222,7 @@
         <w:t xml:space="preserve">(Lin et al. 2019)</w:t>
       </w:r>
       <w:r>
-        <w:t xml:space="preserve">. Rehabilitation programs should therefore include task-specific training that induces plasticity and drives genuine motor recovery, with individualized strategies helping to identify relevant therapeutic goals and maximize functional gain</w:t>
+        <w:t xml:space="preserve">. Rehabilitation programs should include task-specific training to induce plasticity and motor recovery. Individualized strategies have been useful in identifying relevant therapeutic goals and maximizing the future gain</w:t>
       </w:r>
       <w:r>
         <w:t xml:space="preserve"> </w:t>
@@ -239,7 +239,7 @@
         <w:pStyle w:val="BodyText"/>
       </w:pPr>
       <w:r>
-        <w:t xml:space="preserve">In our companion computational study, we showed that a reward-driven reinforcement learning (RL) controller trained on a reaching-inspired obstacle-avoidance task spontaneously develops internal population representations that parallel several organizational features of biological motor cortex — including compact low-dimensional manifolds, phase-aligned population states, and adaptive trajectory-level correction under perturbation</w:t>
+        <w:t xml:space="preserve">In this study, our overarching goal is to develop a user-friendly rehabilitation program for upper limb post-stroke management. We intend to provide a detailed diagnosis of undesirable compensation strategies used by post-stroke patients, comparing the standard trajectories set by artificial neural networks with the trajectories of both healthy and suffering patients. Using our framework, we want to show parallels that describe the internal representation in biological neurons during recovery</w:t>
       </w:r>
       <w:r>
         <w:t xml:space="preserve"> </w:t>
@@ -248,45 +248,16 @@
         <w:t xml:space="preserve">(Ohue et al. 2026)</w:t>
       </w:r>
       <w:r>
-        <w:t xml:space="preserve">. That work, together with our broader perspective on building accessible computational-neuroscience tools and curricula</w:t>
-      </w:r>
-      <w:r>
-        <w:t xml:space="preserve"> </w:t>
-      </w:r>
-      <w:r>
-        <w:t xml:space="preserve">(Chinagorom and Ohue 2025)</w:t>
-      </w:r>
-      <w:r>
-        <w:t xml:space="preserve"> </w:t>
-      </w:r>
-      <w:r>
-        <w:t xml:space="preserve">and our open-source Python tooling for computational neuroscience</w:t>
-      </w:r>
-      <w:r>
-        <w:t xml:space="preserve"> </w:t>
-      </w:r>
-      <w:r>
-        <w:t xml:space="preserve">(Ohue 2026)</w:t>
-      </w:r>
-      <w:r>
-        <w:t xml:space="preserve">, motivates the present study’s overarching goal: to develop a user-friendly, adaptive rehabilitation program for upper-limb post-stroke management.</w:t>
-      </w:r>
-    </w:p>
-    <w:p>
-      <w:pPr>
-        <w:pStyle w:val="BodyText"/>
-      </w:pPr>
-      <w:r>
-        <w:t xml:space="preserve">Specifically, we aim to (1) provide a detailed, quantitative diagnosis of undesirable compensation strategies used by post-stroke patients, by comparing standard reference trajectories generated by our RL controller against the trajectories of both healthy participants (performing simulated compensations) and post-stroke survivors in the TRSP dataset; (2) use this comparison to illustrate parallels between the internal representations of an artificial motor-control policy and biological motor recovery processes</w:t>
-      </w:r>
-      <w:r>
-        <w:t xml:space="preserve"> </w:t>
-      </w:r>
-      <w:r>
-        <w:t xml:space="preserve">(Ohue et al. 2026)</w:t>
-      </w:r>
-      <w:r>
-        <w:t xml:space="preserve">; and (3) lay the groundwork for an adaptive motor-relearning program built around a neuro-inspired wearable assistive device for upper-limb stroke rehabilitation. By pairing open-source control algorithms with low-cost, open-hardware designs, our long-term goal is to build accessible, adaptive wearable devices that help stroke survivors relearn natural movement.</w:t>
+        <w:t xml:space="preserve">. This builds on our earlier work on accessible computational-neuroscience tools and training</w:t>
+      </w:r>
+      <w:r>
+        <w:t xml:space="preserve"> </w:t>
+      </w:r>
+      <w:r>
+        <w:t xml:space="preserve">(Chinagorom and Ohue 2025; Ohue 2026)</w:t>
+      </w:r>
+      <w:r>
+        <w:t xml:space="preserve">. In addition, we seek to develop an adaptive motor relearning program using a neuroinspired wearable assistive device for upper-limb stroke rehabilitation. By pairing our open-source control algorithms with low-cost, open-hardware designs, our goal is to build accessible, adaptive wearable devices that help stroke survivors relearn natural movement.</w:t>
       </w:r>
     </w:p>
     <w:p>
@@ -297,7 +268,7 @@
       </w:r>
     </w:p>
     <w:bookmarkEnd w:id="10"/>
-    <w:bookmarkStart w:id="17" w:name="methodology"/>
+    <w:bookmarkStart w:id="16" w:name="methodology"/>
     <w:p>
       <w:pPr>
         <w:pStyle w:val="Heading2"/>
@@ -306,13 +277,85 @@
         <w:t xml:space="preserve">Methodology</w:t>
       </w:r>
     </w:p>
-    <w:bookmarkStart w:id="11" w:name="overview"/>
+    <w:p>
+      <w:pPr>
+        <w:pStyle w:val="FirstParagraph"/>
+      </w:pPr>
+      <w:r>
+        <w:t xml:space="preserve">We developed an open-source Proximal Policy Optimization (PPO) model, which is an advanced AI control algorithm to simulate how human arms adapt and navigate obstacles under unexpected physical disruptions</w:t>
+      </w:r>
+      <w:r>
+        <w:t xml:space="preserve"> </w:t>
+      </w:r>
+      <w:r>
+        <w:t xml:space="preserve">(Schulman et al. 2017)</w:t>
+      </w:r>
+      <w:r>
+        <w:t xml:space="preserve">. This work is currently undergoing internal review for publication</w:t>
+      </w:r>
+      <w:r>
+        <w:t xml:space="preserve"> </w:t>
+      </w:r>
+      <w:r>
+        <w:t xml:space="preserve">(Ohue et al. 2026)</w:t>
+      </w:r>
+      <w:r>
+        <w:t xml:space="preserve">.</w:t>
+      </w:r>
+    </w:p>
+    <w:bookmarkStart w:id="11" w:name="core-innovation-project-vision"/>
     <w:p>
       <w:pPr>
         <w:pStyle w:val="Heading3"/>
       </w:pPr>
       <w:r>
-        <w:t xml:space="preserve">Overview</w:t>
+        <w:t xml:space="preserve">Core Innovation &amp; Project Vision</w:t>
+      </w:r>
+    </w:p>
+    <w:p>
+      <w:pPr>
+        <w:pStyle w:val="Compact"/>
+        <w:numPr>
+          <w:ilvl w:val="0"/>
+          <w:numId w:val="1001"/>
+        </w:numPr>
+      </w:pPr>
+      <w:r>
+        <w:t xml:space="preserve">An open-access RL motor-control framework (PPO agent) modeling sensorimotor adaptation, obstacle avoidance, and unlearning/relearning dynamics during stroke recovery.</w:t>
+      </w:r>
+    </w:p>
+    <w:p>
+      <w:pPr>
+        <w:pStyle w:val="Compact"/>
+        <w:numPr>
+          <w:ilvl w:val="0"/>
+          <w:numId w:val="1001"/>
+        </w:numPr>
+      </w:pPr>
+      <w:r>
+        <w:t xml:space="preserve">A low-cost, open-spec motorized arm sleeve designed for home recovery and community clinics, augmenting expensive proprietary devices with smart, open-source software.</w:t>
+      </w:r>
+    </w:p>
+    <w:p>
+      <w:pPr>
+        <w:pStyle w:val="Compact"/>
+        <w:numPr>
+          <w:ilvl w:val="0"/>
+          <w:numId w:val="1001"/>
+        </w:numPr>
+      </w:pPr>
+      <w:r>
+        <w:t xml:space="preserve">Extending our open-source AI models to lower-limb assistive devices to reduce device abandonment and support natural gait dynamics globally.</w:t>
+      </w:r>
+    </w:p>
+    <w:bookmarkEnd w:id="11"/>
+    <w:bookmarkStart w:id="12" w:name="rl-reference-trajectories"/>
+    <w:p>
+      <w:pPr>
+        <w:pStyle w:val="Heading3"/>
+      </w:pPr>
+      <w:r>
+        <w:t xml:space="preserve">RL reference trajectories</w:t>
       </w:r>
     </w:p>
     <w:p>
@@ -320,58 +363,7 @@
         <w:pStyle w:val="FirstParagraph"/>
       </w:pPr>
       <w:r>
-        <w:t xml:space="preserve">This study extends the reinforcement-learning framework and analysis pipeline of our companion paper</w:t>
-      </w:r>
-      <w:r>
-        <w:t xml:space="preserve"> </w:t>
-      </w:r>
-      <w:r>
-        <w:t xml:space="preserve">(Ohue et al. 2026)</w:t>
-      </w:r>
-      <w:r>
-        <w:t xml:space="preserve"> </w:t>
-      </w:r>
-      <w:r>
-        <w:t xml:space="preserve">with (1) a clinically grounded comparison against human reach kinematics from the TRSP dataset</w:t>
-      </w:r>
-      <w:r>
-        <w:t xml:space="preserve"> </w:t>
-      </w:r>
-      <w:r>
-        <w:t xml:space="preserve">(Dolatabadi et al. 2017; Zhi et al. 2018)</w:t>
-      </w:r>
-      <w:r>
-        <w:t xml:space="preserve">, and (2) a proposed wearable sensor architecture for delivering adaptive feedback outside the lab.</w:t>
-      </w:r>
-    </w:p>
-    <w:bookmarkEnd w:id="11"/>
-    <w:bookmarkStart w:id="12" w:name="X5bfdf40f861e72b8afb4398e509eeb2fa9f2f65"/>
-    <w:p>
-      <w:pPr>
-        <w:pStyle w:val="Heading3"/>
-      </w:pPr>
-      <w:r>
-        <w:t xml:space="preserve">2.1 Reinforcement-learning reference-trajectory model (inherited from Ohue et al., 2026)</w:t>
-      </w:r>
-    </w:p>
-    <w:p>
-      <w:pPr>
-        <w:pStyle w:val="FirstParagraph"/>
-      </w:pPr>
-      <w:r>
-        <w:t xml:space="preserve">The RL controller is a Proximal Policy Optimization (PPO) actor-critic agent</w:t>
-      </w:r>
-      <w:r>
-        <w:t xml:space="preserve"> </w:t>
-      </w:r>
-      <w:r>
-        <w:t xml:space="preserve">(Schulman et al. 2017)</w:t>
-      </w:r>
-      <w:r>
-        <w:t xml:space="preserve"> </w:t>
-      </w:r>
-      <w:r>
-        <w:t xml:space="preserve">trained in a 2-D point-mass reaching environment under Newtonian dynamics. The agent’s state</w:t>
+        <w:t xml:space="preserve">The RL controller is a PPO actor-critic agent trained in a 2-D point-mass reaching environment under Newtonian dynamics. Its state</w:t>
       </w:r>
       <w:r>
         <w:t xml:space="preserve"> </w:t>
@@ -936,7 +928,7 @@
         <w:t xml:space="preserve"> </w:t>
       </w:r>
       <w:r>
-        <w:t xml:space="preserve">is point-mass, and</w:t>
+        <w:t xml:space="preserve">is the point-mass, and</w:t>
       </w:r>
       <w:r>
         <w:t xml:space="preserve"> </w:t>
@@ -978,128 +970,7 @@
         <w:t xml:space="preserve"> </w:t>
       </w:r>
       <w:r>
-        <w:t xml:space="preserve">is a graded lateral force impulse applied during a fixed perturbation window (used in the companion paper to probe adaptive correction). The policy</w:t>
-      </w:r>
-      <w:r>
-        <w:t xml:space="preserve"> </w:t>
-      </w:r>
-      <m:oMath>
-        <m:sSub>
-          <m:e>
-            <m:r>
-              <m:t>π</m:t>
-            </m:r>
-          </m:e>
-          <m:sub>
-            <m:r>
-              <m:t>θ</m:t>
-            </m:r>
-          </m:sub>
-        </m:sSub>
-        <m:r>
-          <m:rPr>
-            <m:sty m:val="p"/>
-          </m:rPr>
-          <m:t>(</m:t>
-        </m:r>
-        <m:sSub>
-          <m:e>
-            <m:r>
-              <m:rPr>
-                <m:sty m:val="b"/>
-              </m:rPr>
-              <m:t>a</m:t>
-            </m:r>
-          </m:e>
-          <m:sub>
-            <m:r>
-              <m:t>t</m:t>
-            </m:r>
-          </m:sub>
-        </m:sSub>
-        <m:r>
-          <m:rPr>
-            <m:sty m:val="p"/>
-          </m:rPr>
-          <m:t>∣</m:t>
-        </m:r>
-        <m:sSub>
-          <m:e>
-            <m:r>
-              <m:rPr>
-                <m:sty m:val="b"/>
-              </m:rPr>
-              <m:t>s</m:t>
-            </m:r>
-          </m:e>
-          <m:sub>
-            <m:r>
-              <m:t>t</m:t>
-            </m:r>
-          </m:sub>
-        </m:sSub>
-        <m:r>
-          <m:rPr>
-            <m:sty m:val="p"/>
-          </m:rPr>
-          <m:t>)</m:t>
-        </m:r>
-      </m:oMath>
-      <w:r>
-        <w:t xml:space="preserve"> </w:t>
-      </w:r>
-      <w:r>
-        <w:t xml:space="preserve">and value function</w:t>
-      </w:r>
-      <w:r>
-        <w:t xml:space="preserve"> </w:t>
-      </w:r>
-      <m:oMath>
-        <m:sSub>
-          <m:e>
-            <m:r>
-              <m:t>V</m:t>
-            </m:r>
-          </m:e>
-          <m:sub>
-            <m:r>
-              <m:t>ϕ</m:t>
-            </m:r>
-          </m:sub>
-        </m:sSub>
-        <m:r>
-          <m:rPr>
-            <m:sty m:val="p"/>
-          </m:rPr>
-          <m:t>(</m:t>
-        </m:r>
-        <m:sSub>
-          <m:e>
-            <m:r>
-              <m:rPr>
-                <m:sty m:val="b"/>
-              </m:rPr>
-              <m:t>s</m:t>
-            </m:r>
-          </m:e>
-          <m:sub>
-            <m:r>
-              <m:t>t</m:t>
-            </m:r>
-          </m:sub>
-        </m:sSub>
-        <m:r>
-          <m:rPr>
-            <m:sty m:val="p"/>
-          </m:rPr>
-          <m:t>)</m:t>
-        </m:r>
-      </m:oMath>
-      <w:r>
-        <w:t xml:space="preserve"> </w:t>
-      </w:r>
-      <w:r>
-        <w:t xml:space="preserve">are two-hidden-layer (256-unit) feedforward networks trained to maximize expected discounted reward via the clipped PPO surrogate objective</w:t>
+        <w:t xml:space="preserve">is a graded lateral force impulse applied during a fixed perturbation window. Policy and value networks are two-hidden-layer (256-unit) feedforward networks, trained with the clipped PPO surrogate objective</w:t>
       </w:r>
     </w:p>
     <w:p>
@@ -1551,30 +1422,17 @@
         <w:pStyle w:val="FirstParagraph"/>
       </w:pPr>
       <w:r>
-        <w:t xml:space="preserve">In this project, the trained policy’s rollout trajectories under each perturbation condition (P0 control; L1–L3, R1–R3 graded lateral perturbations) serve as</w:t>
-      </w:r>
-      <w:r>
-        <w:t xml:space="preserve"> </w:t>
-      </w:r>
-      <w:r>
-        <w:rPr>
-          <w:b/>
-          <w:bCs/>
-        </w:rPr>
-        <w:t xml:space="preserve">reference trajectories</w:t>
-      </w:r>
-      <w:r>
-        <w:t xml:space="preserve">: task-optimal, unconstrained-anatomy movement paths against which human reach geometry can be compared for evidence of compensation.</w:t>
+        <w:t xml:space="preserve">We treat the trained policy’s rollouts under each perturbation condition (P0 control; L1–L3, R1–R3 graded lateral perturbations) as reference trajectories: task-optimal movement paths, unconstrained by anatomy, against which human reach geometry can be compared for compensation.</w:t>
       </w:r>
     </w:p>
     <w:bookmarkEnd w:id="12"/>
-    <w:bookmarkStart w:id="13" w:name="X9a3ec27538c44f4c462eaf866d62cdedfe729d5"/>
+    <w:bookmarkStart w:id="13" w:name="human-reach-kinematics-data"/>
     <w:p>
       <w:pPr>
         <w:pStyle w:val="Heading3"/>
       </w:pPr>
       <w:r>
-        <w:t xml:space="preserve">2.2 Human reach-kinematics data (Toronto Rehab Stroke Pose dataset)</w:t>
+        <w:t xml:space="preserve">Human reach-kinematics data</w:t>
       </w:r>
     </w:p>
     <w:p>
@@ -1582,7 +1440,7 @@
         <w:pStyle w:val="FirstParagraph"/>
       </w:pPr>
       <w:r>
-        <w:t xml:space="preserve">We use the TRSP dataset</w:t>
+        <w:t xml:space="preserve">We use the Toronto Rehab Stroke Pose (TRSP) dataset</w:t>
       </w:r>
       <w:r>
         <w:t xml:space="preserve"> </w:t>
@@ -1591,248 +1449,7 @@
         <w:t xml:space="preserve">(Dolatabadi et al. 2017; Zhi et al. 2018)</w:t>
       </w:r>
       <w:r>
-        <w:t xml:space="preserve">, comprising Kinect-derived 3-D joint-position time series (25-joint skeleton, recorded at consistent frame rate) for:</w:t>
-      </w:r>
-    </w:p>
-    <w:p>
-      <w:pPr>
-        <w:pStyle w:val="Compact"/>
-        <w:numPr>
-          <w:ilvl w:val="0"/>
-          <w:numId w:val="1001"/>
-        </w:numPr>
-      </w:pPr>
-      <w:r>
-        <w:rPr>
-          <w:b/>
-          <w:bCs/>
-        </w:rPr>
-        <w:t xml:space="preserve">10 healthy participants (H01–H10)</w:t>
-      </w:r>
-      <w:r>
-        <w:t xml:space="preserve"> </w:t>
-      </w:r>
-      <w:r>
-        <w:t xml:space="preserve">performing standardized forward/backward and side-to-side reaches, each repeated under a natural (non-compensated) condition and under three simulated compensation strategies: forward trunk lean (</w:t>
-      </w:r>
-      <w:r>
-        <w:rPr>
-          <w:rStyle w:val="VerbatimChar"/>
-        </w:rPr>
-        <w:t xml:space="preserve">LnFwr</w:t>
-      </w:r>
-      <w:r>
-        <w:t xml:space="preserve">), shoulder elevation (</w:t>
-      </w:r>
-      <w:r>
-        <w:rPr>
-          <w:rStyle w:val="VerbatimChar"/>
-        </w:rPr>
-        <w:t xml:space="preserve">ShElev</w:t>
-      </w:r>
-      <w:r>
-        <w:t xml:space="preserve">), and trunk rotation (</w:t>
-      </w:r>
-      <w:r>
-        <w:rPr>
-          <w:rStyle w:val="VerbatimChar"/>
-        </w:rPr>
-        <w:t xml:space="preserve">TrRot</w:t>
-      </w:r>
-      <w:r>
-        <w:t xml:space="preserve">), each to the left and/or right (</w:t>
-      </w:r>
-      <w:r>
-        <w:rPr>
-          <w:rStyle w:val="VerbatimChar"/>
-        </w:rPr>
-        <w:t xml:space="preserve">_L</w:t>
-      </w:r>
-      <w:r>
-        <w:t xml:space="preserve">/</w:t>
-      </w:r>
-      <w:r>
-        <w:rPr>
-          <w:rStyle w:val="VerbatimChar"/>
-        </w:rPr>
-        <w:t xml:space="preserve">_R</w:t>
-      </w:r>
-      <w:r>
-        <w:t xml:space="preserve">).</w:t>
-      </w:r>
-    </w:p>
-    <w:p>
-      <w:pPr>
-        <w:pStyle w:val="Compact"/>
-        <w:numPr>
-          <w:ilvl w:val="0"/>
-          <w:numId w:val="1001"/>
-        </w:numPr>
-      </w:pPr>
-      <w:r>
-        <w:rPr>
-          <w:b/>
-          <w:bCs/>
-        </w:rPr>
-        <w:t xml:space="preserve">9 post-stroke participants (P01–P09)</w:t>
-      </w:r>
-      <w:r>
-        <w:t xml:space="preserve"> </w:t>
-      </w:r>
-      <w:r>
-        <w:t xml:space="preserve">performing the same reach tasks without instructed compensation, i.e. producing whatever compensation strategy (if any) they naturally adopt.</w:t>
-      </w:r>
-    </w:p>
-    <w:p>
-      <w:pPr>
-        <w:pStyle w:val="FirstParagraph"/>
-      </w:pPr>
-      <w:r>
-        <w:t xml:space="preserve">Each trial directory contains</w:t>
-      </w:r>
-      <w:r>
-        <w:t xml:space="preserve"> </w:t>
-      </w:r>
-      <w:r>
-        <w:rPr>
-          <w:rStyle w:val="VerbatimChar"/>
-        </w:rPr>
-        <w:t xml:space="preserve">Joint_Positions.csv</w:t>
-      </w:r>
-      <w:r>
-        <w:t xml:space="preserve"> </w:t>
-      </w:r>
-      <w:r>
-        <w:t xml:space="preserve">(25 joints × 3 coordinates, stacked frame-by-frame) and</w:t>
-      </w:r>
-      <w:r>
-        <w:t xml:space="preserve"> </w:t>
-      </w:r>
-      <w:r>
-        <w:rPr>
-          <w:rStyle w:val="VerbatimChar"/>
-        </w:rPr>
-        <w:t xml:space="preserve">Labels.csv</w:t>
-      </w:r>
-      <w:r>
-        <w:t xml:space="preserve"> </w:t>
-      </w:r>
-      <w:r>
-        <w:t xml:space="preserve">(one compensation/phase label per frame). See</w:t>
-      </w:r>
-      <w:r>
-        <w:t xml:space="preserve"> </w:t>
-      </w:r>
-      <w:r>
-        <w:rPr>
-          <w:rStyle w:val="VerbatimChar"/>
-        </w:rPr>
-        <w:t xml:space="preserve">data/raw/README.md</w:t>
-      </w:r>
-      <w:r>
-        <w:t xml:space="preserve"> </w:t>
-      </w:r>
-      <w:r>
-        <w:t xml:space="preserve">for the verified file schema.</w:t>
-      </w:r>
-    </w:p>
-    <w:bookmarkEnd w:id="13"/>
-    <w:bookmarkStart w:id="14" w:name="Xbee6053dbb1a694dafb233b3f0228112f62e0e8"/>
-    <w:p>
-      <w:pPr>
-        <w:pStyle w:val="Heading3"/>
-      </w:pPr>
-      <w:r>
-        <w:t xml:space="preserve">2.3 Trajectory alignment and compensation quantification</w:t>
-      </w:r>
-    </w:p>
-    <w:p>
-      <w:pPr>
-        <w:pStyle w:val="FirstParagraph"/>
-      </w:pPr>
-      <w:r>
-        <w:rPr>
-          <w:i/>
-          <w:iCs/>
-        </w:rPr>
-        <w:t xml:space="preserve">[Planned, not yet implemented]</w:t>
-      </w:r>
-      <w:r>
-        <w:t xml:space="preserve"> </w:t>
-      </w:r>
-      <w:r>
-        <w:t xml:space="preserve">Human shoulder–elbow–wrist joint trajectories will be projected onto the same 2-D reach-plane convention as the RL environment (Section 2.1), time-normalized per trial, and compared against the matching-condition RL reference trajectory using: (i) path-length and lateral-deviation metrics consistent with the trajectory analysis already implemented in</w:t>
-      </w:r>
-      <w:r>
-        <w:t xml:space="preserve"> </w:t>
-      </w:r>
-      <w:r>
-        <w:rPr>
-          <w:rStyle w:val="VerbatimChar"/>
-        </w:rPr>
-        <w:t xml:space="preserve">analysis/behavioural/</w:t>
-      </w:r>
-      <w:r>
-        <w:t xml:space="preserve">; (ii) explicit compensation features — trunk rotation angle, shoulder elevation, and forward lean — following the automatic detection approach of Zhi et al. (2018); and (iii) the PCA/decoding pipeline from the companion paper</w:t>
-      </w:r>
-      <w:r>
-        <w:t xml:space="preserve"> </w:t>
-      </w:r>
-      <w:r>
-        <w:t xml:space="preserve">(Ohue et al. 2026)</w:t>
-      </w:r>
-      <w:r>
-        <w:t xml:space="preserve">, applied here to human kinematic features rather than RL hidden-layer activity, to test whether compensation strategies form separable low-dimensional clusters analogous to the RL controller’s phase-aligned latent states.</w:t>
-      </w:r>
-    </w:p>
-    <w:bookmarkEnd w:id="14"/>
-    <w:bookmarkStart w:id="15" w:name="Xac48333fe8e2859e3cd624b4810a0384f27c4c6"/>
-    <w:p>
-      <w:pPr>
-        <w:pStyle w:val="Heading3"/>
-      </w:pPr>
-      <w:r>
-        <w:t xml:space="preserve">2.4 Wearable sensor framework (proposed architecture)</w:t>
-      </w:r>
-    </w:p>
-    <w:p>
-      <w:pPr>
-        <w:pStyle w:val="FirstParagraph"/>
-      </w:pPr>
-      <w:r>
-        <w:rPr>
-          <w:i/>
-          <w:iCs/>
-        </w:rPr>
-        <w:t xml:space="preserve">[Design phase]</w:t>
-      </w:r>
-      <w:r>
-        <w:t xml:space="preserve"> </w:t>
-      </w:r>
-      <w:r>
-        <w:t xml:space="preserve">We propose a low-cost, open-hardware motorized arm sleeve instrumented with inertial measurement units (IMU) at the upper arm, forearm, and trunk, to estimate the same compensation features in real time outside the lab. Sensor-derived joint angles will be compared continuously against the RL-generated reference trajectory for the corresponding reach task, with deviations beyond a clinician-set tolerance triggering real-time feedback — extending the real-time visual-feedback approach shown to reduce compensatory motion in home-based exercise</w:t>
-      </w:r>
-      <w:r>
-        <w:t xml:space="preserve"> </w:t>
-      </w:r>
-      <w:r>
-        <w:t xml:space="preserve">(Lin et al. 2019)</w:t>
-      </w:r>
-      <w:r>
-        <w:t xml:space="preserve"> </w:t>
-      </w:r>
-      <w:r>
-        <w:t xml:space="preserve">to a continuously adaptive, model-based reference rather than a fixed target.</w:t>
-      </w:r>
-    </w:p>
-    <w:bookmarkEnd w:id="15"/>
-    <w:bookmarkStart w:id="16" w:name="core-innovation-and-project-vision"/>
-    <w:p>
-      <w:pPr>
-        <w:pStyle w:val="Heading3"/>
-      </w:pPr>
-      <w:r>
-        <w:t xml:space="preserve">Core innovation and project vision</w:t>
+        <w:t xml:space="preserve">. It contains Kinect-derived 3-D joint-position time series (25-joint skeleton) for:</w:t>
       </w:r>
     </w:p>
     <w:p>
@@ -1844,16 +1461,52 @@
         </w:numPr>
       </w:pPr>
       <w:r>
-        <w:t xml:space="preserve">An open-access RL motor-control framework (PPO agent) modelling sensorimotor adaptation, obstacle avoidance, and unlearning/relearning dynamics relevant to stroke recovery</w:t>
-      </w:r>
-      <w:r>
-        <w:t xml:space="preserve"> </w:t>
-      </w:r>
-      <w:r>
-        <w:t xml:space="preserve">(Ohue et al. 2026)</w:t>
-      </w:r>
-      <w:r>
-        <w:t xml:space="preserve">.</w:t>
+        <w:t xml:space="preserve">10 healthy participants (H01–H10), each performing standardized forward/backward and side-to-side reaches under a natural condition and under three simulated compensations: forward trunk lean (</w:t>
+      </w:r>
+      <w:r>
+        <w:rPr>
+          <w:rStyle w:val="VerbatimChar"/>
+        </w:rPr>
+        <w:t xml:space="preserve">LnFwr</w:t>
+      </w:r>
+      <w:r>
+        <w:t xml:space="preserve">), shoulder elevation (</w:t>
+      </w:r>
+      <w:r>
+        <w:rPr>
+          <w:rStyle w:val="VerbatimChar"/>
+        </w:rPr>
+        <w:t xml:space="preserve">ShElev</w:t>
+      </w:r>
+      <w:r>
+        <w:t xml:space="preserve">), and trunk rotation (</w:t>
+      </w:r>
+      <w:r>
+        <w:rPr>
+          <w:rStyle w:val="VerbatimChar"/>
+        </w:rPr>
+        <w:t xml:space="preserve">TrRot</w:t>
+      </w:r>
+      <w:r>
+        <w:t xml:space="preserve">), left and right (</w:t>
+      </w:r>
+      <w:r>
+        <w:rPr>
+          <w:rStyle w:val="VerbatimChar"/>
+        </w:rPr>
+        <w:t xml:space="preserve">_L</w:t>
+      </w:r>
+      <w:r>
+        <w:t xml:space="preserve">/</w:t>
+      </w:r>
+      <w:r>
+        <w:rPr>
+          <w:rStyle w:val="VerbatimChar"/>
+        </w:rPr>
+        <w:t xml:space="preserve">_R</w:t>
+      </w:r>
+      <w:r>
+        <w:t xml:space="preserve">).</w:t>
       </w:r>
     </w:p>
     <w:p>
@@ -1865,28 +1518,198 @@
         </w:numPr>
       </w:pPr>
       <w:r>
-        <w:t xml:space="preserve">A low-cost, open-spec motorized arm sleeve for home recovery and community clinics, pairing smart open-source software with affordable hardware as an alternative/complement to expensive proprietary devices</w:t>
-      </w:r>
-      <w:r>
-        <w:t xml:space="preserve"> </w:t>
-      </w:r>
-      <w:r>
-        <w:t xml:space="preserve">(Sugawara et al. 2018)</w:t>
+        <w:t xml:space="preserve">9 post-stroke participants (P01–P09) performing the same reach tasks without an instructed compensation strategy.</w:t>
+      </w:r>
+    </w:p>
+    <w:p>
+      <w:pPr>
+        <w:pStyle w:val="FirstParagraph"/>
+      </w:pPr>
+      <w:r>
+        <w:t xml:space="preserve">Each trial directory contains</w:t>
+      </w:r>
+      <w:r>
+        <w:t xml:space="preserve"> </w:t>
+      </w:r>
+      <w:r>
+        <w:rPr>
+          <w:rStyle w:val="VerbatimChar"/>
+        </w:rPr>
+        <w:t xml:space="preserve">Joint_Positions.csv</w:t>
+      </w:r>
+      <w:r>
+        <w:t xml:space="preserve"> </w:t>
+      </w:r>
+      <w:r>
+        <w:t xml:space="preserve">(25 joints x 3 coordinates, stacked frame by frame) and</w:t>
+      </w:r>
+      <w:r>
+        <w:t xml:space="preserve"> </w:t>
+      </w:r>
+      <w:r>
+        <w:rPr>
+          <w:rStyle w:val="VerbatimChar"/>
+        </w:rPr>
+        <w:t xml:space="preserve">Labels.csv</w:t>
+      </w:r>
+      <w:r>
+        <w:t xml:space="preserve"> </w:t>
+      </w:r>
+      <w:r>
+        <w:t xml:space="preserve">(one label per frame). The file schema is documented in</w:t>
+      </w:r>
+      <w:r>
+        <w:t xml:space="preserve"> </w:t>
+      </w:r>
+      <w:r>
+        <w:rPr>
+          <w:rStyle w:val="VerbatimChar"/>
+        </w:rPr>
+        <w:t xml:space="preserve">data/raw/README.md</w:t>
       </w:r>
       <w:r>
         <w:t xml:space="preserve">.</w:t>
       </w:r>
     </w:p>
-    <w:p>
-      <w:pPr>
-        <w:pStyle w:val="Compact"/>
-        <w:numPr>
-          <w:ilvl w:val="0"/>
-          <w:numId w:val="1002"/>
-        </w:numPr>
-      </w:pPr>
-      <w:r>
-        <w:t xml:space="preserve">A longer-term path to extend these open-source models to lower-limb assistive devices, aiming to reduce device abandonment and support natural gait dynamics more broadly.</w:t>
+    <w:bookmarkEnd w:id="13"/>
+    <w:bookmarkStart w:id="14" w:name="Xbee6053dbb1a694dafb233b3f0228112f62e0e8"/>
+    <w:p>
+      <w:pPr>
+        <w:pStyle w:val="Heading3"/>
+      </w:pPr>
+      <w:r>
+        <w:t xml:space="preserve">Trajectory alignment and compensation quantification</w:t>
+      </w:r>
+    </w:p>
+    <w:p>
+      <w:pPr>
+        <w:pStyle w:val="FirstParagraph"/>
+      </w:pPr>
+      <w:r>
+        <w:t xml:space="preserve">Human wrist trajectories are projected onto their own 2-D reach plane by PCA, resampled to a common time base, and rigidly aligned (translation + uniform scale) to the matching RL reference trajectory. We report a path-length ratio and the mean/max lateral deviation between the two. Three compensation features are computed per frame directly from the joint data: forward lean angle, trunk rotation angle, and shoulder elevation, following the compensation categories used to build the TRSP dataset</w:t>
+      </w:r>
+      <w:r>
+        <w:t xml:space="preserve"> </w:t>
+      </w:r>
+      <w:r>
+        <w:t xml:space="preserve">(Zhi et al. 2018)</w:t>
+      </w:r>
+      <w:r>
+        <w:t xml:space="preserve">. This pipeline is implemented in</w:t>
+      </w:r>
+      <w:r>
+        <w:t xml:space="preserve"> </w:t>
+      </w:r>
+      <w:r>
+        <w:rPr>
+          <w:rStyle w:val="VerbatimChar"/>
+        </w:rPr>
+        <w:t xml:space="preserve">src/clinical/</w:t>
+      </w:r>
+      <w:r>
+        <w:t xml:space="preserve"> </w:t>
+      </w:r>
+      <w:r>
+        <w:t xml:space="preserve">(</w:t>
+      </w:r>
+      <w:r>
+        <w:rPr>
+          <w:rStyle w:val="VerbatimChar"/>
+        </w:rPr>
+        <w:t xml:space="preserve">trsp_loader.py</w:t>
+      </w:r>
+      <w:r>
+        <w:t xml:space="preserve">,</w:t>
+      </w:r>
+      <w:r>
+        <w:t xml:space="preserve"> </w:t>
+      </w:r>
+      <w:r>
+        <w:rPr>
+          <w:rStyle w:val="VerbatimChar"/>
+        </w:rPr>
+        <w:t xml:space="preserve">compensation_metrics.py</w:t>
+      </w:r>
+      <w:r>
+        <w:t xml:space="preserve">,</w:t>
+      </w:r>
+      <w:r>
+        <w:t xml:space="preserve"> </w:t>
+      </w:r>
+      <w:r>
+        <w:rPr>
+          <w:rStyle w:val="VerbatimChar"/>
+        </w:rPr>
+        <w:t xml:space="preserve">trajectory_alignment.py</w:t>
+      </w:r>
+      <w:r>
+        <w:t xml:space="preserve">) and runs end-to-end via</w:t>
+      </w:r>
+      <w:r>
+        <w:t xml:space="preserve"> </w:t>
+      </w:r>
+      <w:r>
+        <w:rPr>
+          <w:rStyle w:val="VerbatimChar"/>
+        </w:rPr>
+        <w:t xml:space="preserve">scripts/compare_rl_vs_trsp.py</w:t>
+      </w:r>
+      <w:r>
+        <w:t xml:space="preserve">. The RL reference is currently a placeholder straight-line path; it will be replaced with real rollouts exported from</w:t>
+      </w:r>
+      <w:r>
+        <w:t xml:space="preserve"> </w:t>
+      </w:r>
+      <w:r>
+        <w:rPr>
+          <w:rStyle w:val="VerbatimChar"/>
+        </w:rPr>
+        <w:t xml:space="preserve">src/evaluation/</w:t>
+      </w:r>
+      <w:r>
+        <w:t xml:space="preserve">.</w:t>
+      </w:r>
+    </w:p>
+    <w:bookmarkEnd w:id="14"/>
+    <w:bookmarkStart w:id="15" w:name="wearable-sensor-framework"/>
+    <w:p>
+      <w:pPr>
+        <w:pStyle w:val="Heading3"/>
+      </w:pPr>
+      <w:r>
+        <w:t xml:space="preserve">Wearable sensor framework</w:t>
+      </w:r>
+    </w:p>
+    <w:p>
+      <w:pPr>
+        <w:pStyle w:val="FirstParagraph"/>
+      </w:pPr>
+      <w:r>
+        <w:t xml:space="preserve">We propose a motorized arm sleeve with three inertial measurement units (trunk, upper arm, forearm) to estimate the same three compensation features outside the lab, in real time. Sensor angles are compared continuously against the RL reference trajectory for the matching reach task; a deviation beyond a clinician-set tolerance triggers feedback. This extends the real-time visual-feedback approach shown to reduce compensatory motion in home-based exercise</w:t>
+      </w:r>
+      <w:r>
+        <w:t xml:space="preserve"> </w:t>
+      </w:r>
+      <w:r>
+        <w:t xml:space="preserve">(Lin et al. 2019)</w:t>
+      </w:r>
+      <w:r>
+        <w:t xml:space="preserve"> </w:t>
+      </w:r>
+      <w:r>
+        <w:t xml:space="preserve">to a model-based, condition-specific reference rather than a single fixed target. The proposed sensor set, microcontroller choice, and validation plan are detailed in</w:t>
+      </w:r>
+      <w:r>
+        <w:t xml:space="preserve"> </w:t>
+      </w:r>
+      <w:r>
+        <w:rPr>
+          <w:rStyle w:val="VerbatimChar"/>
+        </w:rPr>
+        <w:t xml:space="preserve">docs/wearable_sleeve_hardware.md</w:t>
+      </w:r>
+      <w:r>
+        <w:t xml:space="preserve">.</w:t>
       </w:r>
     </w:p>
     <w:p>
@@ -1896,9 +1719,9 @@
         </w:pict>
       </w:r>
     </w:p>
+    <w:bookmarkEnd w:id="15"/>
     <w:bookmarkEnd w:id="16"/>
-    <w:bookmarkEnd w:id="17"/>
-    <w:bookmarkStart w:id="18" w:name="results"/>
+    <w:bookmarkStart w:id="17" w:name="results"/>
     <w:p>
       <w:pPr>
         <w:pStyle w:val="Heading2"/>
@@ -1919,8 +1742,8 @@
         <w:t xml:space="preserve">[Phase 2 — to be added.]</w:t>
       </w:r>
     </w:p>
-    <w:bookmarkEnd w:id="18"/>
-    <w:bookmarkStart w:id="19" w:name="discussion"/>
+    <w:bookmarkEnd w:id="17"/>
+    <w:bookmarkStart w:id="18" w:name="discussion"/>
     <w:p>
       <w:pPr>
         <w:pStyle w:val="Heading2"/>
@@ -1941,26 +1764,26 @@
         <w:t xml:space="preserve">[Phase 2 — to be added.]</w:t>
       </w:r>
     </w:p>
+    <w:bookmarkEnd w:id="18"/>
+    <w:bookmarkStart w:id="19" w:name="acknowledgements"/>
+    <w:p>
+      <w:pPr>
+        <w:pStyle w:val="Heading2"/>
+      </w:pPr>
+      <w:r>
+        <w:t xml:space="preserve">Acknowledgements</w:t>
+      </w:r>
+    </w:p>
+    <w:p>
+      <w:pPr>
+        <w:pStyle w:val="FirstParagraph"/>
+      </w:pPr>
+      <w:r>
+        <w:t xml:space="preserve">This work was supported in part by the Connected Minds Program, Canada First Research Excellence Fund, Grant No. CFREF-2022-00010.</w:t>
+      </w:r>
+    </w:p>
     <w:bookmarkEnd w:id="19"/>
-    <w:bookmarkStart w:id="20" w:name="acknowledgements"/>
-    <w:p>
-      <w:pPr>
-        <w:pStyle w:val="Heading2"/>
-      </w:pPr>
-      <w:r>
-        <w:t xml:space="preserve">Acknowledgements</w:t>
-      </w:r>
-    </w:p>
-    <w:p>
-      <w:pPr>
-        <w:pStyle w:val="FirstParagraph"/>
-      </w:pPr>
-      <w:r>
-        <w:t xml:space="preserve">This work was supported in part by the Connected Minds Program, Canada First Research Excellence Fund, Grant No. CFREF-2022-00010.</w:t>
-      </w:r>
-    </w:p>
-    <w:bookmarkEnd w:id="20"/>
-    <w:bookmarkStart w:id="55" w:name="references"/>
+    <w:bookmarkStart w:id="54" w:name="references"/>
     <w:p>
       <w:pPr>
         <w:pStyle w:val="Heading2"/>
@@ -1986,50 +1809,11 @@
         <w:t xml:space="preserve">paper/references.bib</w:t>
       </w:r>
       <w:r>
-        <w:t xml:space="preserve">. Citation keys used above (e.g. </w:t>
-      </w:r>
-      <w:r>
-        <w:rPr>
-          <w:rStyle w:val="VerbatimChar"/>
-        </w:rPr>
-        <w:t xml:space="preserve">[@Ohue2026]</w:t>
-      </w:r>
-      <w:r>
-        <w:t xml:space="preserve">) follow standard pandoc/BibTeX</w:t>
-      </w:r>
-      <w:r>
-        <w:t xml:space="preserve"> </w:t>
-      </w:r>
-      <w:r>
-        <w:rPr>
-          <w:rStyle w:val="VerbatimChar"/>
-        </w:rPr>
-        <w:t xml:space="preserve">@key</w:t>
-      </w:r>
-      <w:r>
-        <w:t xml:space="preserve"> </w:t>
-      </w:r>
-      <w:r>
-        <w:t xml:space="preserve">notation and should be converted to</w:t>
-      </w:r>
-      <w:r>
-        <w:t xml:space="preserve"> </w:t>
-      </w:r>
-      <w:r>
-        <w:rPr>
-          <w:rStyle w:val="VerbatimChar"/>
-        </w:rPr>
-        <w:t xml:space="preserve">\cite{key}</w:t>
-      </w:r>
-      <w:r>
-        <w:t xml:space="preserve"> </w:t>
-      </w:r>
-      <w:r>
-        <w:t xml:space="preserve">if/when this draft moves to the LaTeX template inherited from paper 1.</w:t>
-      </w:r>
-    </w:p>
-    <w:bookmarkStart w:id="54" w:name="refs"/>
-    <w:bookmarkStart w:id="22" w:name="ref-Averta2018"/>
+        <w:t xml:space="preserve">.</w:t>
+      </w:r>
+    </w:p>
+    <w:bookmarkStart w:id="53" w:name="refs"/>
+    <w:bookmarkStart w:id="21" w:name="ref-Averta2018"/>
     <w:p>
       <w:pPr>
         <w:pStyle w:val="Bibliography"/>
@@ -2065,7 +1849,7 @@
       <w:r>
         <w:t xml:space="preserve"> </w:t>
       </w:r>
-      <w:hyperlink r:id="rId21">
+      <w:hyperlink r:id="rId20">
         <w:r>
           <w:rPr>
             <w:rStyle w:val="Hyperlink"/>
@@ -2077,8 +1861,8 @@
         <w:t xml:space="preserve">.</w:t>
       </w:r>
     </w:p>
-    <w:bookmarkEnd w:id="22"/>
-    <w:bookmarkStart w:id="24" w:name="ref-Chinagorom2025"/>
+    <w:bookmarkEnd w:id="21"/>
+    <w:bookmarkStart w:id="23" w:name="ref-Chinagorom2025"/>
     <w:p>
       <w:pPr>
         <w:pStyle w:val="Bibliography"/>
@@ -2111,7 +1895,7 @@
       <w:r>
         <w:t xml:space="preserve"> </w:t>
       </w:r>
-      <w:hyperlink r:id="rId23">
+      <w:hyperlink r:id="rId22">
         <w:r>
           <w:rPr>
             <w:rStyle w:val="Hyperlink"/>
@@ -2123,8 +1907,8 @@
         <w:t xml:space="preserve">.</w:t>
       </w:r>
     </w:p>
-    <w:bookmarkEnd w:id="24"/>
-    <w:bookmarkStart w:id="26" w:name="ref-Dolatabadi2017"/>
+    <w:bookmarkEnd w:id="23"/>
+    <w:bookmarkStart w:id="25" w:name="ref-Dolatabadi2017"/>
     <w:p>
       <w:pPr>
         <w:pStyle w:val="Bibliography"/>
@@ -2154,7 +1938,7 @@
       <w:r>
         <w:t xml:space="preserve"> </w:t>
       </w:r>
-      <w:hyperlink r:id="rId25">
+      <w:hyperlink r:id="rId24">
         <w:r>
           <w:rPr>
             <w:rStyle w:val="Hyperlink"/>
@@ -2166,8 +1950,8 @@
         <w:t xml:space="preserve">.</w:t>
       </w:r>
     </w:p>
-    <w:bookmarkEnd w:id="26"/>
-    <w:bookmarkStart w:id="28" w:name="ref-Gowland1993"/>
+    <w:bookmarkEnd w:id="25"/>
+    <w:bookmarkStart w:id="27" w:name="ref-Gowland1993"/>
     <w:p>
       <w:pPr>
         <w:pStyle w:val="Bibliography"/>
@@ -2200,7 +1984,7 @@
       <w:r>
         <w:t xml:space="preserve"> </w:t>
       </w:r>
-      <w:hyperlink r:id="rId27">
+      <w:hyperlink r:id="rId26">
         <w:r>
           <w:rPr>
             <w:rStyle w:val="Hyperlink"/>
@@ -2212,8 +1996,8 @@
         <w:t xml:space="preserve">.</w:t>
       </w:r>
     </w:p>
-    <w:bookmarkEnd w:id="28"/>
-    <w:bookmarkStart w:id="30" w:name="ref-Hu2018"/>
+    <w:bookmarkEnd w:id="27"/>
+    <w:bookmarkStart w:id="29" w:name="ref-Hu2018"/>
     <w:p>
       <w:pPr>
         <w:pStyle w:val="Bibliography"/>
@@ -2243,7 +2027,7 @@
       <w:r>
         <w:t xml:space="preserve"> </w:t>
       </w:r>
-      <w:hyperlink r:id="rId29">
+      <w:hyperlink r:id="rId28">
         <w:r>
           <w:rPr>
             <w:rStyle w:val="Hyperlink"/>
@@ -2255,8 +2039,8 @@
         <w:t xml:space="preserve">.</w:t>
       </w:r>
     </w:p>
-    <w:bookmarkEnd w:id="30"/>
-    <w:bookmarkStart w:id="32" w:name="ref-JarqueBou2019"/>
+    <w:bookmarkEnd w:id="29"/>
+    <w:bookmarkStart w:id="31" w:name="ref-JarqueBou2019"/>
     <w:p>
       <w:pPr>
         <w:pStyle w:val="Bibliography"/>
@@ -2289,7 +2073,7 @@
       <w:r>
         <w:t xml:space="preserve"> </w:t>
       </w:r>
-      <w:hyperlink r:id="rId31">
+      <w:hyperlink r:id="rId30">
         <w:r>
           <w:rPr>
             <w:rStyle w:val="Hyperlink"/>
@@ -2301,8 +2085,8 @@
         <w:t xml:space="preserve">.</w:t>
       </w:r>
     </w:p>
-    <w:bookmarkEnd w:id="32"/>
-    <w:bookmarkStart w:id="34" w:name="ref-Kuriakose2020"/>
+    <w:bookmarkEnd w:id="31"/>
+    <w:bookmarkStart w:id="33" w:name="ref-Kuriakose2020"/>
     <w:p>
       <w:pPr>
         <w:pStyle w:val="Bibliography"/>
@@ -2335,7 +2119,7 @@
       <w:r>
         <w:t xml:space="preserve"> </w:t>
       </w:r>
-      <w:hyperlink r:id="rId33">
+      <w:hyperlink r:id="rId32">
         <w:r>
           <w:rPr>
             <w:rStyle w:val="Hyperlink"/>
@@ -2347,8 +2131,8 @@
         <w:t xml:space="preserve">.</w:t>
       </w:r>
     </w:p>
-    <w:bookmarkEnd w:id="34"/>
-    <w:bookmarkStart w:id="36" w:name="ref-Lin2019"/>
+    <w:bookmarkEnd w:id="33"/>
+    <w:bookmarkStart w:id="35" w:name="ref-Lin2019"/>
     <w:p>
       <w:pPr>
         <w:pStyle w:val="Bibliography"/>
@@ -2381,7 +2165,7 @@
       <w:r>
         <w:t xml:space="preserve"> </w:t>
       </w:r>
-      <w:hyperlink r:id="rId35">
+      <w:hyperlink r:id="rId34">
         <w:r>
           <w:rPr>
             <w:rStyle w:val="Hyperlink"/>
@@ -2393,8 +2177,8 @@
         <w:t xml:space="preserve">.</w:t>
       </w:r>
     </w:p>
-    <w:bookmarkEnd w:id="36"/>
-    <w:bookmarkStart w:id="38" w:name="ref-Lu2012"/>
+    <w:bookmarkEnd w:id="35"/>
+    <w:bookmarkStart w:id="37" w:name="ref-Lu2012"/>
     <w:p>
       <w:pPr>
         <w:pStyle w:val="Bibliography"/>
@@ -2427,7 +2211,7 @@
       <w:r>
         <w:t xml:space="preserve"> </w:t>
       </w:r>
-      <w:hyperlink r:id="rId37">
+      <w:hyperlink r:id="rId36">
         <w:r>
           <w:rPr>
             <w:rStyle w:val="Hyperlink"/>
@@ -2439,8 +2223,8 @@
         <w:t xml:space="preserve">.</w:t>
       </w:r>
     </w:p>
-    <w:bookmarkEnd w:id="38"/>
-    <w:bookmarkStart w:id="40" w:name="ref-Lucchetti2025"/>
+    <w:bookmarkEnd w:id="37"/>
+    <w:bookmarkStart w:id="39" w:name="ref-Lucchetti2025"/>
     <w:p>
       <w:pPr>
         <w:pStyle w:val="Bibliography"/>
@@ -2473,7 +2257,7 @@
       <w:r>
         <w:t xml:space="preserve"> </w:t>
       </w:r>
-      <w:hyperlink r:id="rId39">
+      <w:hyperlink r:id="rId38">
         <w:r>
           <w:rPr>
             <w:rStyle w:val="Hyperlink"/>
@@ -2485,8 +2269,8 @@
         <w:t xml:space="preserve">.</w:t>
       </w:r>
     </w:p>
-    <w:bookmarkEnd w:id="40"/>
-    <w:bookmarkStart w:id="42" w:name="ref-Mehrholz2015"/>
+    <w:bookmarkEnd w:id="39"/>
+    <w:bookmarkStart w:id="41" w:name="ref-Mehrholz2015"/>
     <w:p>
       <w:pPr>
         <w:pStyle w:val="Bibliography"/>
@@ -2516,7 +2300,7 @@
       <w:r>
         <w:t xml:space="preserve"> </w:t>
       </w:r>
-      <w:hyperlink r:id="rId41">
+      <w:hyperlink r:id="rId40">
         <w:r>
           <w:rPr>
             <w:rStyle w:val="Hyperlink"/>
@@ -2528,8 +2312,8 @@
         <w:t xml:space="preserve">.</w:t>
       </w:r>
     </w:p>
-    <w:bookmarkEnd w:id="42"/>
-    <w:bookmarkStart w:id="43" w:name="ref-OhuePythonUnpub"/>
+    <w:bookmarkEnd w:id="41"/>
+    <w:bookmarkStart w:id="42" w:name="ref-OhuePythonUnpub"/>
     <w:p>
       <w:pPr>
         <w:pStyle w:val="Bibliography"/>
@@ -2551,8 +2335,8 @@
         <w:t xml:space="preserve">.</w:t>
       </w:r>
     </w:p>
-    <w:bookmarkEnd w:id="43"/>
-    <w:bookmarkStart w:id="44" w:name="ref-Ohue2026"/>
+    <w:bookmarkEnd w:id="42"/>
+    <w:bookmarkStart w:id="43" w:name="ref-Ohue2026"/>
     <w:p>
       <w:pPr>
         <w:pStyle w:val="Bibliography"/>
@@ -2574,8 +2358,8 @@
         <w:t xml:space="preserve">.</w:t>
       </w:r>
     </w:p>
-    <w:bookmarkEnd w:id="44"/>
-    <w:bookmarkStart w:id="46" w:name="ref-Saudabayev2018"/>
+    <w:bookmarkEnd w:id="43"/>
+    <w:bookmarkStart w:id="45" w:name="ref-Saudabayev2018"/>
     <w:p>
       <w:pPr>
         <w:pStyle w:val="Bibliography"/>
@@ -2608,7 +2392,7 @@
       <w:r>
         <w:t xml:space="preserve"> </w:t>
       </w:r>
-      <w:hyperlink r:id="rId45">
+      <w:hyperlink r:id="rId44">
         <w:r>
           <w:rPr>
             <w:rStyle w:val="Hyperlink"/>
@@ -2620,8 +2404,8 @@
         <w:t xml:space="preserve">.</w:t>
       </w:r>
     </w:p>
-    <w:bookmarkEnd w:id="46"/>
-    <w:bookmarkStart w:id="47" w:name="ref-Schulman2017"/>
+    <w:bookmarkEnd w:id="45"/>
+    <w:bookmarkStart w:id="46" w:name="ref-Schulman2017"/>
     <w:p>
       <w:pPr>
         <w:pStyle w:val="Bibliography"/>
@@ -2649,8 +2433,8 @@
         <w:t xml:space="preserve">.</w:t>
       </w:r>
     </w:p>
-    <w:bookmarkEnd w:id="47"/>
-    <w:bookmarkStart w:id="49" w:name="ref-Sugawara2018"/>
+    <w:bookmarkEnd w:id="46"/>
+    <w:bookmarkStart w:id="48" w:name="ref-Sugawara2018"/>
     <w:p>
       <w:pPr>
         <w:pStyle w:val="Bibliography"/>
@@ -2683,7 +2467,7 @@
       <w:r>
         <w:t xml:space="preserve"> </w:t>
       </w:r>
-      <w:hyperlink r:id="rId48">
+      <w:hyperlink r:id="rId47">
         <w:r>
           <w:rPr>
             <w:rStyle w:val="Hyperlink"/>
@@ -2695,8 +2479,8 @@
         <w:t xml:space="preserve">.</w:t>
       </w:r>
     </w:p>
-    <w:bookmarkEnd w:id="49"/>
-    <w:bookmarkStart w:id="51" w:name="ref-Takeuchi2013"/>
+    <w:bookmarkEnd w:id="48"/>
+    <w:bookmarkStart w:id="50" w:name="ref-Takeuchi2013"/>
     <w:p>
       <w:pPr>
         <w:pStyle w:val="Bibliography"/>
@@ -2729,7 +2513,7 @@
       <w:r>
         <w:t xml:space="preserve"> </w:t>
       </w:r>
-      <w:hyperlink r:id="rId50">
+      <w:hyperlink r:id="rId49">
         <w:r>
           <w:rPr>
             <w:rStyle w:val="Hyperlink"/>
@@ -2741,8 +2525,8 @@
         <w:t xml:space="preserve">.</w:t>
       </w:r>
     </w:p>
-    <w:bookmarkEnd w:id="51"/>
-    <w:bookmarkStart w:id="53" w:name="ref-Zhi2018"/>
+    <w:bookmarkEnd w:id="50"/>
+    <w:bookmarkStart w:id="52" w:name="ref-Zhi2018"/>
     <w:p>
       <w:pPr>
         <w:pStyle w:val="Bibliography"/>
@@ -2775,7 +2559,7 @@
       <w:r>
         <w:t xml:space="preserve"> </w:t>
       </w:r>
-      <w:hyperlink r:id="rId52">
+      <w:hyperlink r:id="rId51">
         <w:r>
           <w:rPr>
             <w:rStyle w:val="Hyperlink"/>
@@ -2787,10 +2571,10 @@
         <w:t xml:space="preserve">.</w:t>
       </w:r>
     </w:p>
+    <w:bookmarkEnd w:id="52"/>
     <w:bookmarkEnd w:id="53"/>
     <w:bookmarkEnd w:id="54"/>
     <w:bookmarkEnd w:id="55"/>
-    <w:bookmarkEnd w:id="56"/>
     <w:sectPr>
       <w:footnotePr>
         <w:numRestart w:val="eachSect"/>
@@ -2901,6 +2685,91 @@
       </w:pPr>
     </w:lvl>
   </w:abstractNum>
+  <w:abstractNum w:abstractNumId="99411">
+    <w:nsid w:val="00A99411"/>
+    <w:multiLevelType w:val="multilevel"/>
+    <w:lvl w:ilvl="0">
+      <w:start w:val="1"/>
+      <w:numFmt w:val="decimal"/>
+      <w:lvlText w:val="%1."/>
+      <w:lvlJc w:val="left"/>
+      <w:pPr>
+        <w:ind w:left="720" w:hanging="360"/>
+      </w:pPr>
+    </w:lvl>
+    <w:lvl w:ilvl="1">
+      <w:start w:val="1"/>
+      <w:numFmt w:val="decimal"/>
+      <w:lvlText w:val="%2."/>
+      <w:lvlJc w:val="left"/>
+      <w:pPr>
+        <w:ind w:left="1440" w:hanging="360"/>
+      </w:pPr>
+    </w:lvl>
+    <w:lvl w:ilvl="2">
+      <w:start w:val="1"/>
+      <w:numFmt w:val="decimal"/>
+      <w:lvlText w:val="%3."/>
+      <w:lvlJc w:val="left"/>
+      <w:pPr>
+        <w:ind w:left="2160" w:hanging="360"/>
+      </w:pPr>
+    </w:lvl>
+    <w:lvl w:ilvl="3">
+      <w:start w:val="1"/>
+      <w:numFmt w:val="decimal"/>
+      <w:lvlText w:val="%4."/>
+      <w:lvlJc w:val="left"/>
+      <w:pPr>
+        <w:ind w:left="2880" w:hanging="360"/>
+      </w:pPr>
+    </w:lvl>
+    <w:lvl w:ilvl="4">
+      <w:start w:val="1"/>
+      <w:numFmt w:val="decimal"/>
+      <w:lvlText w:val="%5."/>
+      <w:lvlJc w:val="left"/>
+      <w:pPr>
+        <w:ind w:left="3600" w:hanging="360"/>
+      </w:pPr>
+    </w:lvl>
+    <w:lvl w:ilvl="5">
+      <w:start w:val="1"/>
+      <w:numFmt w:val="decimal"/>
+      <w:lvlText w:val="%6."/>
+      <w:lvlJc w:val="left"/>
+      <w:pPr>
+        <w:ind w:left="4320" w:hanging="360"/>
+      </w:pPr>
+    </w:lvl>
+    <w:lvl w:ilvl="6">
+      <w:start w:val="1"/>
+      <w:numFmt w:val="decimal"/>
+      <w:lvlText w:val="%7."/>
+      <w:lvlJc w:val="left"/>
+      <w:pPr>
+        <w:ind w:left="5040" w:hanging="360"/>
+      </w:pPr>
+    </w:lvl>
+    <w:lvl w:ilvl="7">
+      <w:start w:val="1"/>
+      <w:numFmt w:val="decimal"/>
+      <w:lvlText w:val="%8."/>
+      <w:lvlJc w:val="left"/>
+      <w:pPr>
+        <w:ind w:left="5760" w:hanging="360"/>
+      </w:pPr>
+    </w:lvl>
+    <w:lvl w:ilvl="8">
+      <w:start w:val="1"/>
+      <w:numFmt w:val="decimal"/>
+      <w:lvlText w:val="%9."/>
+      <w:lvlJc w:val="left"/>
+      <w:pPr>
+        <w:ind w:left="6480" w:hanging="360"/>
+      </w:pPr>
+    </w:lvl>
+  </w:abstractNum>
   <w:abstractNum w:abstractNumId="991">
     <w:nsid w:val="0000A991"/>
     <w:multiLevelType w:val="multilevel"/>
@@ -3004,98 +2873,10 @@
       </w:rPr>
     </w:lvl>
   </w:abstractNum>
-  <w:abstractNum w:abstractNumId="99411">
-    <w:nsid w:val="00A99411"/>
-    <w:multiLevelType w:val="multilevel"/>
-    <w:lvl w:ilvl="0">
-      <w:start w:val="1"/>
-      <w:numFmt w:val="decimal"/>
-      <w:lvlText w:val="%1."/>
-      <w:lvlJc w:val="left"/>
-      <w:pPr>
-        <w:ind w:left="720" w:hanging="360"/>
-      </w:pPr>
-    </w:lvl>
-    <w:lvl w:ilvl="1">
-      <w:start w:val="1"/>
-      <w:numFmt w:val="decimal"/>
-      <w:lvlText w:val="%2."/>
-      <w:lvlJc w:val="left"/>
-      <w:pPr>
-        <w:ind w:left="1440" w:hanging="360"/>
-      </w:pPr>
-    </w:lvl>
-    <w:lvl w:ilvl="2">
-      <w:start w:val="1"/>
-      <w:numFmt w:val="decimal"/>
-      <w:lvlText w:val="%3."/>
-      <w:lvlJc w:val="left"/>
-      <w:pPr>
-        <w:ind w:left="2160" w:hanging="360"/>
-      </w:pPr>
-    </w:lvl>
-    <w:lvl w:ilvl="3">
-      <w:start w:val="1"/>
-      <w:numFmt w:val="decimal"/>
-      <w:lvlText w:val="%4."/>
-      <w:lvlJc w:val="left"/>
-      <w:pPr>
-        <w:ind w:left="2880" w:hanging="360"/>
-      </w:pPr>
-    </w:lvl>
-    <w:lvl w:ilvl="4">
-      <w:start w:val="1"/>
-      <w:numFmt w:val="decimal"/>
-      <w:lvlText w:val="%5."/>
-      <w:lvlJc w:val="left"/>
-      <w:pPr>
-        <w:ind w:left="3600" w:hanging="360"/>
-      </w:pPr>
-    </w:lvl>
-    <w:lvl w:ilvl="5">
-      <w:start w:val="1"/>
-      <w:numFmt w:val="decimal"/>
-      <w:lvlText w:val="%6."/>
-      <w:lvlJc w:val="left"/>
-      <w:pPr>
-        <w:ind w:left="4320" w:hanging="360"/>
-      </w:pPr>
-    </w:lvl>
-    <w:lvl w:ilvl="6">
-      <w:start w:val="1"/>
-      <w:numFmt w:val="decimal"/>
-      <w:lvlText w:val="%7."/>
-      <w:lvlJc w:val="left"/>
-      <w:pPr>
-        <w:ind w:left="5040" w:hanging="360"/>
-      </w:pPr>
-    </w:lvl>
-    <w:lvl w:ilvl="7">
-      <w:start w:val="1"/>
-      <w:numFmt w:val="decimal"/>
-      <w:lvlText w:val="%8."/>
-      <w:lvlJc w:val="left"/>
-      <w:pPr>
-        <w:ind w:left="5760" w:hanging="360"/>
-      </w:pPr>
-    </w:lvl>
-    <w:lvl w:ilvl="8">
-      <w:start w:val="1"/>
-      <w:numFmt w:val="decimal"/>
-      <w:lvlText w:val="%9."/>
-      <w:lvlJc w:val="left"/>
-      <w:pPr>
-        <w:ind w:left="6480" w:hanging="360"/>
-      </w:pPr>
-    </w:lvl>
-  </w:abstractNum>
   <w:num w:numId="1000">
     <w:abstractNumId w:val="990"/>
   </w:num>
   <w:num w:numId="1001">
-    <w:abstractNumId w:val="991"/>
-  </w:num>
-  <w:num w:numId="1002">
     <w:abstractNumId w:val="99411"/>
     <w:lvlOverride w:ilvl="0">
       <w:startOverride w:val="1"/>
@@ -3124,6 +2905,9 @@
     <w:lvlOverride w:ilvl="8">
       <w:startOverride w:val="1"/>
     </w:lvlOverride>
+  </w:num>
+  <w:num w:numId="1002">
+    <w:abstractNumId w:val="991"/>
   </w:num>
 </w:numbering>
 </file>

</xml_diff>

<commit_message>
Remove AI-voice phrasing: rewrite em-dash asides, drop promotional adjectives; rebuild manuscript.docx
</commit_message>
<xml_diff>
--- a/paper/manuscript.docx
+++ b/paper/manuscript.docx
@@ -46,7 +46,7 @@
           <w:i/>
           <w:iCs/>
         </w:rPr>
-        <w:t xml:space="preserve">Draft — Phase 1 (Abstract / Introduction / Methodology). Results and Discussion to follow in later phases per author’s iterative writeup process.</w:t>
+        <w:t xml:space="preserve">Draft: Phase 1 (Abstract / Introduction / Methodology). Results and Discussion to follow in later phases per author’s iterative writeup process.</w:t>
       </w:r>
     </w:p>
     <w:p>
@@ -74,7 +74,7 @@
           <w:i/>
           <w:iCs/>
         </w:rPr>
-        <w:t xml:space="preserve">[To be completed once Results are finalized — target ~200 words summarizing motivation, approach (RL reference trajectories + TRSP comparison + wearable sleeve concept), and key contribution.]</w:t>
+        <w:t xml:space="preserve">[To be completed once Results are finalized. Target ~200 words summarizing motivation, approach (RL reference trajectories + TRSP comparison + wearable sleeve concept), and key contribution.]</w:t>
       </w:r>
     </w:p>
     <w:p>
@@ -282,7 +282,7 @@
         <w:pStyle w:val="FirstParagraph"/>
       </w:pPr>
       <w:r>
-        <w:t xml:space="preserve">We developed an open-source Proximal Policy Optimization (PPO) model, which is an advanced AI control algorithm to simulate how human arms adapt and navigate obstacles under unexpected physical disruptions</w:t>
+        <w:t xml:space="preserve">We developed an open-source Proximal Policy Optimization (PPO) model, a reinforcement-learning control algorithm, to simulate how human arms adapt and navigate obstacles under unexpected physical disruptions</w:t>
       </w:r>
       <w:r>
         <w:t xml:space="preserve"> </w:t>
@@ -303,13 +303,13 @@
         <w:t xml:space="preserve">.</w:t>
       </w:r>
     </w:p>
-    <w:bookmarkStart w:id="11" w:name="core-innovation-project-vision"/>
+    <w:bookmarkStart w:id="11" w:name="project-vision"/>
     <w:p>
       <w:pPr>
         <w:pStyle w:val="Heading3"/>
       </w:pPr>
       <w:r>
-        <w:t xml:space="preserve">Core Innovation &amp; Project Vision</w:t>
+        <w:t xml:space="preserve">Project vision</w:t>
       </w:r>
     </w:p>
     <w:p>
@@ -333,7 +333,7 @@
         </w:numPr>
       </w:pPr>
       <w:r>
-        <w:t xml:space="preserve">A low-cost, open-spec motorized arm sleeve designed for home recovery and community clinics, augmenting expensive proprietary devices with smart, open-source software.</w:t>
+        <w:t xml:space="preserve">A low-cost, open-spec motorized arm sleeve designed for home recovery and community clinics, as an open-source alternative to expensive proprietary devices.</w:t>
       </w:r>
     </w:p>
     <w:p>
@@ -345,7 +345,7 @@
         </w:numPr>
       </w:pPr>
       <w:r>
-        <w:t xml:space="preserve">Extending our open-source AI models to lower-limb assistive devices to reduce device abandonment and support natural gait dynamics globally.</w:t>
+        <w:t xml:space="preserve">Extending our open-source AI models to lower-limb assistive devices to reduce device abandonment and support natural gait dynamics.</w:t>
       </w:r>
     </w:p>
     <w:bookmarkEnd w:id="11"/>
@@ -1739,7 +1739,7 @@
           <w:i/>
           <w:iCs/>
         </w:rPr>
-        <w:t xml:space="preserve">[Phase 2 — to be added.]</w:t>
+        <w:t xml:space="preserve">[Phase 2: to be added.]</w:t>
       </w:r>
     </w:p>
     <w:bookmarkEnd w:id="17"/>
@@ -1761,7 +1761,7 @@
           <w:i/>
           <w:iCs/>
         </w:rPr>
-        <w:t xml:space="preserve">[Phase 2 — to be added.]</w:t>
+        <w:t xml:space="preserve">[Phase 2: to be added.]</w:t>
       </w:r>
     </w:p>
     <w:bookmarkEnd w:id="18"/>

</xml_diff>

<commit_message>
Add real RL reference export/comparison pipeline, tighten Introduction literature flow, add Overleaf-ready manuscript.tex
</commit_message>
<xml_diff>
--- a/paper/manuscript.docx
+++ b/paper/manuscript.docx
@@ -99,7 +99,7 @@
         <w:pStyle w:val="FirstParagraph"/>
       </w:pPr>
       <w:r>
-        <w:t xml:space="preserve">Stroke, which is caused by the disruption of blood flow to the brain, affects more than 13 million people worldwide, kills more than 5 million annually, and is a major cause of disability</w:t>
+        <w:t xml:space="preserve">Stroke disrupts blood flow to the brain. It affects more than 13 million people worldwide, kills more than 5 million people annually, and is a leading cause of long-term disability</w:t>
       </w:r>
       <w:r>
         <w:t xml:space="preserve"> </w:t>
@@ -108,7 +108,7 @@
         <w:t xml:space="preserve">(Lu et al. 2012; Kuriakose and Xiao 2020)</w:t>
       </w:r>
       <w:r>
-        <w:t xml:space="preserve">. Motor deficits are one major neurological consequence of stroke, leading to a loss of independence and lower quality of life</w:t>
+        <w:t xml:space="preserve">. Motor deficits are a major neurological consequence of stroke and are associated with loss of independence and reduced quality of life</w:t>
       </w:r>
       <w:r>
         <w:t xml:space="preserve"> </w:t>
@@ -117,7 +117,7 @@
         <w:t xml:space="preserve">(Lucchetti et al. 2025)</w:t>
       </w:r>
       <w:r>
-        <w:t xml:space="preserve">. The physical impairments associated with stroke survivors need to be properly diagnosed, including changes in physical function of the affected limb, and the recommendation of appropriate remediation</w:t>
+        <w:t xml:space="preserve">. Accurate diagnosis of the resulting physical impairment, including changes in function of the affected limb, is a prerequisite for recommending appropriate remediation</w:t>
       </w:r>
       <w:r>
         <w:t xml:space="preserve"> </w:t>
@@ -134,7 +134,7 @@
         <w:pStyle w:val="BodyText"/>
       </w:pPr>
       <w:r>
-        <w:t xml:space="preserve">Shoulder-arm kinematics and muscular synergies involve at least 30 daily-life tasks, and hand postural synergies play a significant role in grasp force</w:t>
+        <w:t xml:space="preserve">Normal upper-limb function during daily-life tasks depends on coordinated shoulder-arm kinematics and muscular synergies across at least 30 common activities, with hand postural synergies contributing substantially to grasp force</w:t>
       </w:r>
       <w:r>
         <w:t xml:space="preserve"> </w:t>
@@ -143,7 +143,7 @@
         <w:t xml:space="preserve">(Hu et al. 2018; Averta et al. 2018; Saudabayev et al. 2018)</w:t>
       </w:r>
       <w:r>
-        <w:t xml:space="preserve">. Linking forearm muscle activity and hand kinematics is essential for developing prosthetics and 3D modelling</w:t>
+        <w:t xml:space="preserve">. Linking forearm muscle activity to hand kinematics is central to prosthetic design and 3-D biomechanical modelling</w:t>
       </w:r>
       <w:r>
         <w:t xml:space="preserve"> </w:t>
@@ -152,6 +152,85 @@
         <w:t xml:space="preserve">(Jarque-Bou et al. 2019)</w:t>
       </w:r>
       <w:r>
+        <w:t xml:space="preserve">; the same coordination is what stroke-related motor deficits disrupt.</w:t>
+      </w:r>
+    </w:p>
+    <w:p>
+      <w:pPr>
+        <w:pStyle w:val="BodyText"/>
+      </w:pPr>
+      <w:r>
+        <w:t xml:space="preserve">When normal coordination is lost, stroke survivors often compensate by recruiting alternative movement pathways and unaffected joints and muscles, a substitution that can be inefficient and reinforce atypical movement patterns</w:t>
+      </w:r>
+      <w:r>
+        <w:t xml:space="preserve"> </w:t>
+      </w:r>
+      <w:r>
+        <w:t xml:space="preserve">(Dolatabadi et al. 2017)</w:t>
+      </w:r>
+      <w:r>
+        <w:t xml:space="preserve">. Rehabilitation devices delivered to patients are frequently abandoned after delivery; abandonment is driven by a poor fit between the device and the user’s actual needs, insufficient user involvement in device selection, and lack of ongoing support once the device is at home</w:t>
+      </w:r>
+      <w:r>
+        <w:t xml:space="preserve"> </w:t>
+      </w:r>
+      <w:r>
+        <w:t xml:space="preserve">(Sugawara et al. 2018)</w:t>
+      </w:r>
+      <w:r>
+        <w:t xml:space="preserve">. Robotic and electromechanical devices carry the same risk, and their cost and clinic-based delivery model make sustained home use harder</w:t>
+      </w:r>
+      <w:r>
+        <w:t xml:space="preserve"> </w:t>
+      </w:r>
+      <w:r>
+        <w:t xml:space="preserve">(Mehrholz et al. 2015)</w:t>
+      </w:r>
+      <w:r>
+        <w:t xml:space="preserve">. An upper-limb rehabilitation device should therefore be low-cost and open-hardware, so it can reach the home and the community clinic rather than only the specialized centre, and adaptive, so it can flag emerging compensation in real time rather than depend only on intermittent clinical supervision.</w:t>
+      </w:r>
+    </w:p>
+    <w:p>
+      <w:pPr>
+        <w:pStyle w:val="BodyText"/>
+      </w:pPr>
+      <w:r>
+        <w:t xml:space="preserve">Home-based use of these devices needs supervision, because unmonitored recruitment of unaffected muscles and joints often leads to undesirable outcomes</w:t>
+      </w:r>
+      <w:r>
+        <w:t xml:space="preserve"> </w:t>
+      </w:r>
+      <w:r>
+        <w:t xml:space="preserve">(Zhi et al. 2018)</w:t>
+      </w:r>
+      <w:r>
+        <w:t xml:space="preserve">. To characterize these compensations, prior work has simulated three types with healthy participants: forward trunk lean, trunk rotation, and shoulder elevation</w:t>
+      </w:r>
+      <w:r>
+        <w:t xml:space="preserve"> </w:t>
+      </w:r>
+      <w:r>
+        <w:t xml:space="preserve">(Zhi et al. 2018; Dolatabadi et al. 2017)</w:t>
+      </w:r>
+      <w:r>
+        <w:t xml:space="preserve">. When post-stroke survivors instead follow homework-based rehabilitation programs without this supervision, new and undesirable compensation patterns risk developing, making later unlearning and relearning necessary</w:t>
+      </w:r>
+      <w:r>
+        <w:t xml:space="preserve"> </w:t>
+      </w:r>
+      <w:r>
+        <w:t xml:space="preserve">(Lin et al. 2019)</w:t>
+      </w:r>
+      <w:r>
+        <w:t xml:space="preserve">. Rehabilitation programs should include task-specific training to induce plasticity and motor recovery; individualized strategies have been useful in identifying relevant therapeutic goals and maximizing long-term gain</w:t>
+      </w:r>
+      <w:r>
+        <w:t xml:space="preserve"> </w:t>
+      </w:r>
+      <w:r>
+        <w:t xml:space="preserve">(Takeuchi and Izumi 2013)</w:t>
+      </w:r>
+      <w:r>
         <w:t xml:space="preserve">.</w:t>
       </w:r>
     </w:p>
@@ -160,86 +239,7 @@
         <w:pStyle w:val="BodyText"/>
       </w:pPr>
       <w:r>
-        <w:t xml:space="preserve">In general, compensation strategies for stroke survivors involve using new pathways, strong joints, and muscles, which can be at least ineffective</w:t>
-      </w:r>
-      <w:r>
-        <w:t xml:space="preserve"> </w:t>
-      </w:r>
-      <w:r>
-        <w:t xml:space="preserve">(Dolatabadi et al. 2017)</w:t>
-      </w:r>
-      <w:r>
-        <w:t xml:space="preserve">. Existing rehabilitation devices are usually abandoned by users after delivery: abandonment is driven by poor fit between the device and the user’s actual needs, insufficient user involvement in device selection, and lack of ongoing support once the device is in the home</w:t>
-      </w:r>
-      <w:r>
-        <w:t xml:space="preserve"> </w:t>
-      </w:r>
-      <w:r>
-        <w:t xml:space="preserve">(Sugawara et al. 2018)</w:t>
-      </w:r>
-      <w:r>
-        <w:t xml:space="preserve">. Robotic and electromechanical devices carry the same risk, and their cost and clinic-based delivery model make sustained home use harder</w:t>
-      </w:r>
-      <w:r>
-        <w:t xml:space="preserve"> </w:t>
-      </w:r>
-      <w:r>
-        <w:t xml:space="preserve">(Mehrholz et al. 2015)</w:t>
-      </w:r>
-      <w:r>
-        <w:t xml:space="preserve">. To address this challenge, we argue that an upper-limb rehabilitation device should be low-cost and open-hardware, so it can reach the home and the community clinic rather than only the specialized centre, and it should be adaptive, so it can flag emerging compensation in real time rather than depend only on intermittent clinical supervision.</w:t>
-      </w:r>
-    </w:p>
-    <w:p>
-      <w:pPr>
-        <w:pStyle w:val="BodyText"/>
-      </w:pPr>
-      <w:r>
-        <w:t xml:space="preserve">The use of these devices needs to be supervised so that survivors do not recruit unaffected muscles and joints, which often leads to undesirable outcomes</w:t>
-      </w:r>
-      <w:r>
-        <w:t xml:space="preserve"> </w:t>
-      </w:r>
-      <w:r>
-        <w:t xml:space="preserve">(Zhi et al. 2018)</w:t>
-      </w:r>
-      <w:r>
-        <w:t xml:space="preserve">. To understand these compensations, previous studies have simulated three types of compensation with healthy participants. These compensations include lean forward, trunk rotation, and shoulder elevation compensations</w:t>
-      </w:r>
-      <w:r>
-        <w:t xml:space="preserve"> </w:t>
-      </w:r>
-      <w:r>
-        <w:t xml:space="preserve">(Zhi et al. 2018; Dolatabadi et al. 2017)</w:t>
-      </w:r>
-      <w:r>
-        <w:t xml:space="preserve">. However, when post-stroke survivors are given homework-based rehabilitation programs, new and undesirable compensation paths risk being developed, making unlearning and relearning necessary</w:t>
-      </w:r>
-      <w:r>
-        <w:t xml:space="preserve"> </w:t>
-      </w:r>
-      <w:r>
-        <w:t xml:space="preserve">(Lin et al. 2019)</w:t>
-      </w:r>
-      <w:r>
-        <w:t xml:space="preserve">. Rehabilitation programs should include task-specific training to induce plasticity and motor recovery. Individualized strategies have been useful in identifying relevant therapeutic goals and maximizing the future gain</w:t>
-      </w:r>
-      <w:r>
-        <w:t xml:space="preserve"> </w:t>
-      </w:r>
-      <w:r>
-        <w:t xml:space="preserve">(Takeuchi and Izumi 2013)</w:t>
-      </w:r>
-      <w:r>
-        <w:t xml:space="preserve">.</w:t>
-      </w:r>
-    </w:p>
-    <w:p>
-      <w:pPr>
-        <w:pStyle w:val="BodyText"/>
-      </w:pPr>
-      <w:r>
-        <w:t xml:space="preserve">In this study, our overarching goal is to develop a user-friendly rehabilitation program for upper limb post-stroke management. We intend to provide a detailed diagnosis of undesirable compensation strategies used by post-stroke patients, comparing the standard trajectories set by artificial neural networks with the trajectories of both healthy and suffering patients. Using our framework, we want to show parallels that describe the internal representation in biological neurons during recovery</w:t>
+        <w:t xml:space="preserve">In this study, our goal is to develop a rehabilitation framework for upper-limb post-stroke management that is usable outside the specialized clinic. We compare RL-generated reference trajectories against the reach kinematics of healthy participants (performing natural and simulated-compensation reaches) and post-stroke participants, to quantify compensation strategies rather than rely on visual inspection alone. This framework builds on a companion computational study relating RL-derived internal representations to internal representations in biological neurons during motor adaptation</w:t>
       </w:r>
       <w:r>
         <w:t xml:space="preserve"> </w:t>
@@ -248,7 +248,7 @@
         <w:t xml:space="preserve">(Ohue et al. 2026)</w:t>
       </w:r>
       <w:r>
-        <w:t xml:space="preserve">. This builds on our earlier work on accessible computational-neuroscience tools and training</w:t>
+        <w:t xml:space="preserve">, and on our earlier work on accessible computational-neuroscience tools and training</w:t>
       </w:r>
       <w:r>
         <w:t xml:space="preserve"> </w:t>
@@ -257,7 +257,7 @@
         <w:t xml:space="preserve">(Chinagorom and Ohue 2025; Ohue 2026)</w:t>
       </w:r>
       <w:r>
-        <w:t xml:space="preserve">. In addition, we seek to develop an adaptive motor relearning program using a neuroinspired wearable assistive device for upper-limb stroke rehabilitation. By pairing our open-source control algorithms with low-cost, open-hardware designs, our goal is to build accessible, adaptive wearable devices that help stroke survivors relearn natural movement.</w:t>
+        <w:t xml:space="preserve">. We further propose an adaptive motor-relearning program built around a neuroinspired wearable sleeve, pairing open-source RL control software with a low-cost, open-hardware design, so stroke survivors can receive continuous, condition-specific feedback while relearning natural movement.</w:t>
       </w:r>
     </w:p>
     <w:p>
@@ -1643,7 +1643,46 @@
         <w:t xml:space="preserve">trajectory_alignment.py</w:t>
       </w:r>
       <w:r>
-        <w:t xml:space="preserve">) and runs end-to-end via</w:t>
+        <w:t xml:space="preserve">,</w:t>
+      </w:r>
+      <w:r>
+        <w:t xml:space="preserve"> </w:t>
+      </w:r>
+      <w:r>
+        <w:rPr>
+          <w:rStyle w:val="VerbatimChar"/>
+        </w:rPr>
+        <w:t xml:space="preserve">rl_reference.py</w:t>
+      </w:r>
+      <w:r>
+        <w:t xml:space="preserve">).</w:t>
+      </w:r>
+      <w:r>
+        <w:t xml:space="preserve"> </w:t>
+      </w:r>
+      <w:r>
+        <w:rPr>
+          <w:rStyle w:val="VerbatimChar"/>
+        </w:rPr>
+        <w:t xml:space="preserve">scripts/export_rl_reference.py</w:t>
+      </w:r>
+      <w:r>
+        <w:t xml:space="preserve"> </w:t>
+      </w:r>
+      <w:r>
+        <w:t xml:space="preserve">averages trained-policy rollouts (from</w:t>
+      </w:r>
+      <w:r>
+        <w:t xml:space="preserve"> </w:t>
+      </w:r>
+      <w:r>
+        <w:rPr>
+          <w:rStyle w:val="VerbatimChar"/>
+        </w:rPr>
+        <w:t xml:space="preserve">scripts/evaluate.py</w:t>
+      </w:r>
+      <w:r>
+        <w:t xml:space="preserve">) into a canonical reference path per perturbation condition, and</w:t>
       </w:r>
       <w:r>
         <w:t xml:space="preserve"> </w:t>
@@ -1655,7 +1694,10 @@
         <w:t xml:space="preserve">scripts/compare_rl_vs_trsp.py</w:t>
       </w:r>
       <w:r>
-        <w:t xml:space="preserve">. The RL reference is currently a placeholder straight-line path; it will be replaced with real rollouts exported from</w:t>
+        <w:t xml:space="preserve"> </w:t>
+      </w:r>
+      <w:r>
+        <w:t xml:space="preserve">/</w:t>
       </w:r>
       <w:r>
         <w:t xml:space="preserve"> </w:t>
@@ -1664,10 +1706,13 @@
         <w:rPr>
           <w:rStyle w:val="VerbatimChar"/>
         </w:rPr>
-        <w:t xml:space="preserve">src/evaluation/</w:t>
-      </w:r>
-      <w:r>
-        <w:t xml:space="preserve">.</w:t>
+        <w:t xml:space="preserve">scripts/batch_compare_rl_vs_trsp.py</w:t>
+      </w:r>
+      <w:r>
+        <w:t xml:space="preserve"> </w:t>
+      </w:r>
+      <w:r>
+        <w:t xml:space="preserve">run the single-trial and full-dataset comparison against that reference (falling back to a straight-line placeholder until a policy has been trained).</w:t>
       </w:r>
     </w:p>
     <w:bookmarkEnd w:id="14"/>

</xml_diff>

<commit_message>
Wire Figure 1 schematic placeholder, add honest Results scaffold, gitignore experiment results
</commit_message>
<xml_diff>
--- a/paper/manuscript.docx
+++ b/paper/manuscript.docx
@@ -75,6 +75,134 @@
           <w:iCs/>
         </w:rPr>
         <w:t xml:space="preserve">[To be completed once Results are finalized. Target ~200 words summarizing motivation, approach (RL reference trajectories + TRSP comparison + wearable sleeve concept), and key contribution.]</w:t>
+      </w:r>
+    </w:p>
+    <w:p>
+      <w:r>
+        <w:pict>
+          <v:rect style="width:0;height:1.5pt" o:hralign="center" o:hrstd="t" o:hr="t"/>
+        </w:pict>
+      </w:r>
+    </w:p>
+    <w:p>
+      <w:pPr>
+        <w:pStyle w:val="FirstParagraph"/>
+      </w:pPr>
+      <w:r>
+        <w:rPr>
+          <w:b/>
+          <w:bCs/>
+        </w:rPr>
+        <w:t xml:space="preserve">Figure 1.</w:t>
+      </w:r>
+      <w:r>
+        <w:t xml:space="preserve"> </w:t>
+      </w:r>
+      <w:r>
+        <w:rPr>
+          <w:i/>
+          <w:iCs/>
+        </w:rPr>
+        <w:t xml:space="preserve">[Upper-limb schematic pending: create</w:t>
+      </w:r>
+      <w:r>
+        <w:rPr>
+          <w:i/>
+          <w:iCs/>
+        </w:rPr>
+        <w:t xml:space="preserve"> </w:t>
+      </w:r>
+      <w:r>
+        <w:rPr>
+          <w:rStyle w:val="VerbatimChar"/>
+          <w:i/>
+          <w:iCs/>
+        </w:rPr>
+        <w:t xml:space="preserve">figures/fig1_schematic.svg</w:t>
+      </w:r>
+      <w:r>
+        <w:rPr>
+          <w:i/>
+          <w:iCs/>
+        </w:rPr>
+        <w:t xml:space="preserve">/</w:t>
+      </w:r>
+      <w:r>
+        <w:rPr>
+          <w:rStyle w:val="VerbatimChar"/>
+          <w:i/>
+          <w:iCs/>
+        </w:rPr>
+        <w:t xml:space="preserve">.png</w:t>
+      </w:r>
+      <w:r>
+        <w:rPr>
+          <w:i/>
+          <w:iCs/>
+        </w:rPr>
+        <w:t xml:space="preserve"> </w:t>
+      </w:r>
+      <w:r>
+        <w:rPr>
+          <w:i/>
+          <w:iCs/>
+        </w:rPr>
+        <w:t xml:space="preserve">following the Inkscape workflow in</w:t>
+      </w:r>
+      <w:r>
+        <w:rPr>
+          <w:i/>
+          <w:iCs/>
+        </w:rPr>
+        <w:t xml:space="preserve"> </w:t>
+      </w:r>
+      <w:r>
+        <w:rPr>
+          <w:rStyle w:val="VerbatimChar"/>
+          <w:i/>
+          <w:iCs/>
+        </w:rPr>
+        <w:t xml:space="preserve">docs/schematic_workflow.md</w:t>
+      </w:r>
+      <w:r>
+        <w:rPr>
+          <w:i/>
+          <w:iCs/>
+        </w:rPr>
+        <w:t xml:space="preserve">, then this reference will render.]</w:t>
+      </w:r>
+    </w:p>
+    <w:tbl>
+      <w:tblPr>
+        <w:tblStyle w:val="FigureTable"/>
+        <w:tblW w:type="auto" w:w="0"/>
+        <w:jc w:val="center"/>
+        <w:tblLook w:firstRow="0" w:lastRow="0" w:firstColumn="0" w:lastColumn="0"/>
+      </w:tblPr>
+      <w:tblGrid>
+        <w:gridCol w:w="7920"/>
+      </w:tblGrid>
+      <w:tr>
+        <w:tc>
+          <w:tcPr/>
+          <w:p>
+            <w:pPr>
+              <w:pStyle w:val="Compact"/>
+              <w:jc w:val="center"/>
+            </w:pPr>
+            <w:r>
+              <w:t xml:space="preserve">Figure 1: Upper-limb reaching schematic showing the shoulder, elbow, and wrist state variables used by the RL environment.</w:t>
+            </w:r>
+          </w:p>
+        </w:tc>
+      </w:tr>
+    </w:tbl>
+    <w:p>
+      <w:pPr>
+        <w:pStyle w:val="ImageCaption"/>
+      </w:pPr>
+      <w:r>
+        <w:t xml:space="preserve">Figure 1: Upper-limb reaching schematic showing the shoulder, elbow, and wrist state variables used by the RL environment.</w:t>
       </w:r>
     </w:p>
     <w:p>
@@ -1784,7 +1912,224 @@
           <w:i/>
           <w:iCs/>
         </w:rPr>
-        <w:t xml:space="preserve">[Phase 2: to be added.]</w:t>
+        <w:t xml:space="preserve">[Phase 2: numbers below are pending a full RL training run. Do not fill in placeholder/smoke-test numbers as findings.]</w:t>
+      </w:r>
+    </w:p>
+    <w:p>
+      <w:pPr>
+        <w:pStyle w:val="BodyText"/>
+      </w:pPr>
+      <w:r>
+        <w:t xml:space="preserve">Once</w:t>
+      </w:r>
+      <w:r>
+        <w:t xml:space="preserve"> </w:t>
+      </w:r>
+      <w:r>
+        <w:rPr>
+          <w:rStyle w:val="VerbatimChar"/>
+        </w:rPr>
+        <w:t xml:space="preserve">scripts/train.py</w:t>
+      </w:r>
+      <w:r>
+        <w:t xml:space="preserve"> </w:t>
+      </w:r>
+      <w:r>
+        <w:t xml:space="preserve">has been run to convergence (</w:t>
+      </w:r>
+      <w:r>
+        <w:rPr>
+          <w:rStyle w:val="VerbatimChar"/>
+        </w:rPr>
+        <w:t xml:space="preserve">configs/training.yaml</w:t>
+      </w:r>
+      <w:r>
+        <w:t xml:space="preserve">: 3,000,000 timesteps) and</w:t>
+      </w:r>
+      <w:r>
+        <w:t xml:space="preserve"> </w:t>
+      </w:r>
+      <w:r>
+        <w:rPr>
+          <w:rStyle w:val="VerbatimChar"/>
+        </w:rPr>
+        <w:t xml:space="preserve">scripts/export_rl_reference.py</w:t>
+      </w:r>
+      <w:r>
+        <w:t xml:space="preserve"> </w:t>
+      </w:r>
+      <w:r>
+        <w:t xml:space="preserve">has exported a real reference trajectory for each perturbation condition,</w:t>
+      </w:r>
+      <w:r>
+        <w:t xml:space="preserve"> </w:t>
+      </w:r>
+      <w:r>
+        <w:rPr>
+          <w:rStyle w:val="VerbatimChar"/>
+        </w:rPr>
+        <w:t xml:space="preserve">scripts/batch_compare_rl_vs_trsp.py</w:t>
+      </w:r>
+      <w:r>
+        <w:t xml:space="preserve"> </w:t>
+      </w:r>
+      <w:r>
+        <w:t xml:space="preserve">produces one row per TRSP trial (149 trials: 10 healthy x up to 12 tasks, 9 post-stroke x variable repeated trials) in</w:t>
+      </w:r>
+      <w:r>
+        <w:t xml:space="preserve"> </w:t>
+      </w:r>
+      <w:r>
+        <w:rPr>
+          <w:rStyle w:val="VerbatimChar"/>
+        </w:rPr>
+        <w:t xml:space="preserve">data/processed/rl_vs_trsp_summary.csv</w:t>
+      </w:r>
+      <w:r>
+        <w:t xml:space="preserve">, with:</w:t>
+      </w:r>
+    </w:p>
+    <w:p>
+      <w:pPr>
+        <w:pStyle w:val="Compact"/>
+        <w:numPr>
+          <w:ilvl w:val="0"/>
+          <w:numId w:val="1003"/>
+        </w:numPr>
+      </w:pPr>
+      <w:r>
+        <w:rPr>
+          <w:rStyle w:val="VerbatimChar"/>
+        </w:rPr>
+        <w:t xml:space="preserve">path_length_ratio</w:t>
+      </w:r>
+      <w:r>
+        <w:t xml:space="preserve">,</w:t>
+      </w:r>
+      <w:r>
+        <w:t xml:space="preserve"> </w:t>
+      </w:r>
+      <w:r>
+        <w:rPr>
+          <w:rStyle w:val="VerbatimChar"/>
+        </w:rPr>
+        <w:t xml:space="preserve">mean_lateral_deviation</w:t>
+      </w:r>
+      <w:r>
+        <w:t xml:space="preserve">,</w:t>
+      </w:r>
+      <w:r>
+        <w:t xml:space="preserve"> </w:t>
+      </w:r>
+      <w:r>
+        <w:rPr>
+          <w:rStyle w:val="VerbatimChar"/>
+        </w:rPr>
+        <w:t xml:space="preserve">max_lateral_deviation</w:t>
+      </w:r>
+      <w:r>
+        <w:t xml:space="preserve"> </w:t>
+      </w:r>
+      <w:r>
+        <w:t xml:space="preserve">per trial, comparing the projected wrist path against the matching RL reference condition.</w:t>
+      </w:r>
+    </w:p>
+    <w:p>
+      <w:pPr>
+        <w:pStyle w:val="Compact"/>
+        <w:numPr>
+          <w:ilvl w:val="0"/>
+          <w:numId w:val="1003"/>
+        </w:numPr>
+      </w:pPr>
+      <w:r>
+        <w:rPr>
+          <w:rStyle w:val="VerbatimChar"/>
+        </w:rPr>
+        <w:t xml:space="preserve">mean_lean_deg</w:t>
+      </w:r>
+      <w:r>
+        <w:t xml:space="preserve">,</w:t>
+      </w:r>
+      <w:r>
+        <w:t xml:space="preserve"> </w:t>
+      </w:r>
+      <w:r>
+        <w:rPr>
+          <w:rStyle w:val="VerbatimChar"/>
+        </w:rPr>
+        <w:t xml:space="preserve">mean_trunk_rot_deg</w:t>
+      </w:r>
+      <w:r>
+        <w:t xml:space="preserve">,</w:t>
+      </w:r>
+      <w:r>
+        <w:t xml:space="preserve"> </w:t>
+      </w:r>
+      <w:r>
+        <w:rPr>
+          <w:rStyle w:val="VerbatimChar"/>
+        </w:rPr>
+        <w:t xml:space="preserve">mean_shoulder_elev</w:t>
+      </w:r>
+      <w:r>
+        <w:t xml:space="preserve"> </w:t>
+      </w:r>
+      <w:r>
+        <w:t xml:space="preserve">per trial, from</w:t>
+      </w:r>
+      <w:r>
+        <w:t xml:space="preserve"> </w:t>
+      </w:r>
+      <w:r>
+        <w:rPr>
+          <w:rStyle w:val="VerbatimChar"/>
+        </w:rPr>
+        <w:t xml:space="preserve">compensation_metrics.py</w:t>
+      </w:r>
+      <w:r>
+        <w:t xml:space="preserve">.</w:t>
+      </w:r>
+    </w:p>
+    <w:p>
+      <w:pPr>
+        <w:pStyle w:val="FirstParagraph"/>
+      </w:pPr>
+      <w:r>
+        <w:t xml:space="preserve">This section will report: (1) path-length ratio and lateral deviation for healthy natural-reach trials vs. the P0 (unperturbed) RL reference, establishing a baseline; (2) the same metrics for healthy simulated-compensation trials (</w:t>
+      </w:r>
+      <w:r>
+        <w:rPr>
+          <w:rStyle w:val="VerbatimChar"/>
+        </w:rPr>
+        <w:t xml:space="preserve">LnFwr</w:t>
+      </w:r>
+      <w:r>
+        <w:t xml:space="preserve">,</w:t>
+      </w:r>
+      <w:r>
+        <w:t xml:space="preserve"> </w:t>
+      </w:r>
+      <w:r>
+        <w:rPr>
+          <w:rStyle w:val="VerbatimChar"/>
+        </w:rPr>
+        <w:t xml:space="preserve">ShElev</w:t>
+      </w:r>
+      <w:r>
+        <w:t xml:space="preserve">,</w:t>
+      </w:r>
+      <w:r>
+        <w:t xml:space="preserve"> </w:t>
+      </w:r>
+      <w:r>
+        <w:rPr>
+          <w:rStyle w:val="VerbatimChar"/>
+        </w:rPr>
+        <w:t xml:space="preserve">TrRot</w:t>
+      </w:r>
+      <w:r>
+        <w:t xml:space="preserve">), to confirm the pipeline detects known, instructed compensations as larger deviations than the natural-reach baseline; (3) the same metrics for post-stroke trials, to test whether uninstructed compensation in this group falls closer to the simulated-compensation range than to the healthy-natural range; and (4) whether comparing against graded perturbation conditions (L1-L3, R1-R3) rather than only P0 changes the group separation.</w:t>
       </w:r>
     </w:p>
     <w:bookmarkEnd w:id="17"/>
@@ -1806,7 +2151,7 @@
           <w:i/>
           <w:iCs/>
         </w:rPr>
-        <w:t xml:space="preserve">[Phase 2: to be added.]</w:t>
+        <w:t xml:space="preserve">[Phase 2: to be added, once Results are populated with a real training run.]</w:t>
       </w:r>
     </w:p>
     <w:bookmarkEnd w:id="18"/>
@@ -2952,6 +3297,9 @@
     </w:lvlOverride>
   </w:num>
   <w:num w:numId="1002">
+    <w:abstractNumId w:val="991"/>
+  </w:num>
+  <w:num w:numId="1003">
     <w:abstractNumId w:val="991"/>
   </w:num>
 </w:numbering>

</xml_diff>

<commit_message>
Generate upper-limb schematic (Figure 1) programmatically, wire into manuscript
</commit_message>
<xml_diff>
--- a/paper/manuscript.docx
+++ b/paper/manuscript.docx
@@ -2,7 +2,7 @@
 <file path=word/document.xml><?xml version="1.0" encoding="utf-8"?>
 <w:document xmlns:w="http://schemas.openxmlformats.org/wordprocessingml/2006/main" xmlns:m="http://schemas.openxmlformats.org/officeDocument/2006/math" xmlns:r="http://schemas.openxmlformats.org/officeDocument/2006/relationships" xmlns:o="urn:schemas-microsoft-com:office:office" xmlns:v="urn:schemas-microsoft-com:vml" xmlns:w10="urn:schemas-microsoft-com:office:word" xmlns:a="http://schemas.openxmlformats.org/drawingml/2006/main" xmlns:pic="http://schemas.openxmlformats.org/drawingml/2006/picture" xmlns:wp="http://schemas.openxmlformats.org/drawingml/2006/wordprocessingDrawing">
   <w:body>
-    <w:bookmarkStart w:id="55" w:name="Xabef83d54ffa0a15b8560ab4e0076cedb4822aa"/>
+    <w:bookmarkStart w:id="58" w:name="Xabef83d54ffa0a15b8560ab4e0076cedb4822aa"/>
     <w:p>
       <w:pPr>
         <w:pStyle w:val="Heading1"/>
@@ -56,7 +56,7 @@
         </w:pict>
       </w:r>
     </w:p>
-    <w:bookmarkStart w:id="9" w:name="abstract"/>
+    <w:bookmarkStart w:id="12" w:name="abstract"/>
     <w:p>
       <w:pPr>
         <w:pStyle w:val="Heading2"/>
@@ -86,117 +86,51 @@
     </w:p>
     <w:p>
       <w:pPr>
-        <w:pStyle w:val="FirstParagraph"/>
-      </w:pPr>
-      <w:r>
-        <w:rPr>
-          <w:b/>
-          <w:bCs/>
-        </w:rPr>
-        <w:t xml:space="preserve">Figure 1.</w:t>
-      </w:r>
-      <w:r>
-        <w:t xml:space="preserve"> </w:t>
-      </w:r>
-      <w:r>
-        <w:rPr>
-          <w:i/>
-          <w:iCs/>
-        </w:rPr>
-        <w:t xml:space="preserve">[Upper-limb schematic pending: create</w:t>
-      </w:r>
-      <w:r>
-        <w:rPr>
-          <w:i/>
-          <w:iCs/>
-        </w:rPr>
-        <w:t xml:space="preserve"> </w:t>
-      </w:r>
-      <w:r>
-        <w:rPr>
-          <w:rStyle w:val="VerbatimChar"/>
-          <w:i/>
-          <w:iCs/>
-        </w:rPr>
-        <w:t xml:space="preserve">figures/fig1_schematic.svg</w:t>
-      </w:r>
-      <w:r>
-        <w:rPr>
-          <w:i/>
-          <w:iCs/>
-        </w:rPr>
-        <w:t xml:space="preserve">/</w:t>
-      </w:r>
-      <w:r>
-        <w:rPr>
-          <w:rStyle w:val="VerbatimChar"/>
-          <w:i/>
-          <w:iCs/>
-        </w:rPr>
-        <w:t xml:space="preserve">.png</w:t>
-      </w:r>
-      <w:r>
-        <w:rPr>
-          <w:i/>
-          <w:iCs/>
-        </w:rPr>
-        <w:t xml:space="preserve"> </w:t>
-      </w:r>
-      <w:r>
-        <w:rPr>
-          <w:i/>
-          <w:iCs/>
-        </w:rPr>
-        <w:t xml:space="preserve">following the Inkscape workflow in</w:t>
-      </w:r>
-      <w:r>
-        <w:rPr>
-          <w:i/>
-          <w:iCs/>
-        </w:rPr>
-        <w:t xml:space="preserve"> </w:t>
-      </w:r>
-      <w:r>
-        <w:rPr>
-          <w:rStyle w:val="VerbatimChar"/>
-          <w:i/>
-          <w:iCs/>
-        </w:rPr>
-        <w:t xml:space="preserve">docs/schematic_workflow.md</w:t>
-      </w:r>
-      <w:r>
-        <w:rPr>
-          <w:i/>
-          <w:iCs/>
-        </w:rPr>
-        <w:t xml:space="preserve">, then this reference will render.]</w:t>
-      </w:r>
-    </w:p>
-    <w:tbl>
-      <w:tblPr>
-        <w:tblStyle w:val="FigureTable"/>
-        <w:tblW w:type="auto" w:w="0"/>
-        <w:jc w:val="center"/>
-        <w:tblLook w:firstRow="0" w:lastRow="0" w:firstColumn="0" w:lastColumn="0"/>
-      </w:tblPr>
-      <w:tblGrid>
-        <w:gridCol w:w="7920"/>
-      </w:tblGrid>
-      <w:tr>
-        <w:tc>
-          <w:tcPr/>
-          <w:p>
-            <w:pPr>
-              <w:pStyle w:val="Compact"/>
-              <w:jc w:val="center"/>
-            </w:pPr>
-            <w:r>
-              <w:t xml:space="preserve">Figure 1: Upper-limb reaching schematic showing the shoulder, elbow, and wrist state variables used by the RL environment.</w:t>
-            </w:r>
-          </w:p>
-        </w:tc>
-      </w:tr>
-    </w:tbl>
+        <w:pStyle w:val="CaptionedFigure"/>
+      </w:pPr>
+      <w:r>
+        <w:drawing>
+          <wp:inline>
+            <wp:extent cx="5334000" cy="5334000"/>
+            <wp:effectExtent b="0" l="0" r="0" t="0"/>
+            <wp:docPr descr="Figure 1: Upper-limb reaching schematic showing the shoulder, elbow, and wrist state variables used by the RL environment." title="" id="10" name="Picture"/>
+            <a:graphic>
+              <a:graphicData uri="http://schemas.openxmlformats.org/drawingml/2006/picture">
+                <pic:pic>
+                  <pic:nvPicPr>
+                    <pic:cNvPr descr="figures/fig1_schematic.png" id="11" name="Picture"/>
+                    <pic:cNvPicPr>
+                      <a:picLocks noChangeArrowheads="1" noChangeAspect="1"/>
+                    </pic:cNvPicPr>
+                  </pic:nvPicPr>
+                  <pic:blipFill>
+                    <a:blip r:embed="rId9"/>
+                    <a:stretch>
+                      <a:fillRect/>
+                    </a:stretch>
+                  </pic:blipFill>
+                  <pic:spPr bwMode="auto">
+                    <a:xfrm>
+                      <a:off x="0" y="0"/>
+                      <a:ext cx="5334000" cy="5334000"/>
+                    </a:xfrm>
+                    <a:prstGeom prst="rect">
+                      <a:avLst/>
+                    </a:prstGeom>
+                    <a:noFill/>
+                    <a:ln w="9525">
+                      <a:noFill/>
+                      <a:headEnd/>
+                      <a:tailEnd/>
+                    </a:ln>
+                  </pic:spPr>
+                </pic:pic>
+              </a:graphicData>
+            </a:graphic>
+          </wp:inline>
+        </w:drawing>
+      </w:r>
+    </w:p>
     <w:p>
       <w:pPr>
         <w:pStyle w:val="ImageCaption"/>
@@ -212,8 +146,8 @@
         </w:pict>
       </w:r>
     </w:p>
-    <w:bookmarkEnd w:id="9"/>
-    <w:bookmarkStart w:id="10" w:name="introduction"/>
+    <w:bookmarkEnd w:id="12"/>
+    <w:bookmarkStart w:id="13" w:name="introduction"/>
     <w:p>
       <w:pPr>
         <w:pStyle w:val="Heading2"/>
@@ -395,8 +329,8 @@
         </w:pict>
       </w:r>
     </w:p>
-    <w:bookmarkEnd w:id="10"/>
-    <w:bookmarkStart w:id="16" w:name="methodology"/>
+    <w:bookmarkEnd w:id="13"/>
+    <w:bookmarkStart w:id="19" w:name="methodology"/>
     <w:p>
       <w:pPr>
         <w:pStyle w:val="Heading2"/>
@@ -431,7 +365,7 @@
         <w:t xml:space="preserve">.</w:t>
       </w:r>
     </w:p>
-    <w:bookmarkStart w:id="11" w:name="project-vision"/>
+    <w:bookmarkStart w:id="14" w:name="project-vision"/>
     <w:p>
       <w:pPr>
         <w:pStyle w:val="Heading3"/>
@@ -476,8 +410,8 @@
         <w:t xml:space="preserve">Extending our open-source AI models to lower-limb assistive devices to reduce device abandonment and support natural gait dynamics.</w:t>
       </w:r>
     </w:p>
-    <w:bookmarkEnd w:id="11"/>
-    <w:bookmarkStart w:id="12" w:name="rl-reference-trajectories"/>
+    <w:bookmarkEnd w:id="14"/>
+    <w:bookmarkStart w:id="15" w:name="rl-reference-trajectories"/>
     <w:p>
       <w:pPr>
         <w:pStyle w:val="Heading3"/>
@@ -1553,8 +1487,8 @@
         <w:t xml:space="preserve">We treat the trained policy’s rollouts under each perturbation condition (P0 control; L1–L3, R1–R3 graded lateral perturbations) as reference trajectories: task-optimal movement paths, unconstrained by anatomy, against which human reach geometry can be compared for compensation.</w:t>
       </w:r>
     </w:p>
-    <w:bookmarkEnd w:id="12"/>
-    <w:bookmarkStart w:id="13" w:name="human-reach-kinematics-data"/>
+    <w:bookmarkEnd w:id="15"/>
+    <w:bookmarkStart w:id="16" w:name="human-reach-kinematics-data"/>
     <w:p>
       <w:pPr>
         <w:pStyle w:val="Heading3"/>
@@ -1699,8 +1633,8 @@
         <w:t xml:space="preserve">.</w:t>
       </w:r>
     </w:p>
-    <w:bookmarkEnd w:id="13"/>
-    <w:bookmarkStart w:id="14" w:name="Xbee6053dbb1a694dafb233b3f0228112f62e0e8"/>
+    <w:bookmarkEnd w:id="16"/>
+    <w:bookmarkStart w:id="17" w:name="Xbee6053dbb1a694dafb233b3f0228112f62e0e8"/>
     <w:p>
       <w:pPr>
         <w:pStyle w:val="Heading3"/>
@@ -1843,8 +1777,8 @@
         <w:t xml:space="preserve">run the single-trial and full-dataset comparison against that reference (falling back to a straight-line placeholder until a policy has been trained).</w:t>
       </w:r>
     </w:p>
-    <w:bookmarkEnd w:id="14"/>
-    <w:bookmarkStart w:id="15" w:name="wearable-sensor-framework"/>
+    <w:bookmarkEnd w:id="17"/>
+    <w:bookmarkStart w:id="18" w:name="wearable-sensor-framework"/>
     <w:p>
       <w:pPr>
         <w:pStyle w:val="Heading3"/>
@@ -1892,9 +1826,9 @@
         </w:pict>
       </w:r>
     </w:p>
-    <w:bookmarkEnd w:id="15"/>
-    <w:bookmarkEnd w:id="16"/>
-    <w:bookmarkStart w:id="17" w:name="results"/>
+    <w:bookmarkEnd w:id="18"/>
+    <w:bookmarkEnd w:id="19"/>
+    <w:bookmarkStart w:id="20" w:name="results"/>
     <w:p>
       <w:pPr>
         <w:pStyle w:val="Heading2"/>
@@ -2132,8 +2066,8 @@
         <w:t xml:space="preserve">), to confirm the pipeline detects known, instructed compensations as larger deviations than the natural-reach baseline; (3) the same metrics for post-stroke trials, to test whether uninstructed compensation in this group falls closer to the simulated-compensation range than to the healthy-natural range; and (4) whether comparing against graded perturbation conditions (L1-L3, R1-R3) rather than only P0 changes the group separation.</w:t>
       </w:r>
     </w:p>
-    <w:bookmarkEnd w:id="17"/>
-    <w:bookmarkStart w:id="18" w:name="discussion"/>
+    <w:bookmarkEnd w:id="20"/>
+    <w:bookmarkStart w:id="21" w:name="discussion"/>
     <w:p>
       <w:pPr>
         <w:pStyle w:val="Heading2"/>
@@ -2154,8 +2088,8 @@
         <w:t xml:space="preserve">[Phase 2: to be added, once Results are populated with a real training run.]</w:t>
       </w:r>
     </w:p>
-    <w:bookmarkEnd w:id="18"/>
-    <w:bookmarkStart w:id="19" w:name="acknowledgements"/>
+    <w:bookmarkEnd w:id="21"/>
+    <w:bookmarkStart w:id="22" w:name="acknowledgements"/>
     <w:p>
       <w:pPr>
         <w:pStyle w:val="Heading2"/>
@@ -2172,8 +2106,8 @@
         <w:t xml:space="preserve">This work was supported in part by the Connected Minds Program, Canada First Research Excellence Fund, Grant No. CFREF-2022-00010.</w:t>
       </w:r>
     </w:p>
-    <w:bookmarkEnd w:id="19"/>
-    <w:bookmarkStart w:id="54" w:name="references"/>
+    <w:bookmarkEnd w:id="22"/>
+    <w:bookmarkStart w:id="57" w:name="references"/>
     <w:p>
       <w:pPr>
         <w:pStyle w:val="Heading2"/>
@@ -2202,8 +2136,8 @@
         <w:t xml:space="preserve">.</w:t>
       </w:r>
     </w:p>
-    <w:bookmarkStart w:id="53" w:name="refs"/>
-    <w:bookmarkStart w:id="21" w:name="ref-Averta2018"/>
+    <w:bookmarkStart w:id="56" w:name="refs"/>
+    <w:bookmarkStart w:id="24" w:name="ref-Averta2018"/>
     <w:p>
       <w:pPr>
         <w:pStyle w:val="Bibliography"/>
@@ -2239,7 +2173,7 @@
       <w:r>
         <w:t xml:space="preserve"> </w:t>
       </w:r>
-      <w:hyperlink r:id="rId20">
+      <w:hyperlink r:id="rId23">
         <w:r>
           <w:rPr>
             <w:rStyle w:val="Hyperlink"/>
@@ -2251,8 +2185,8 @@
         <w:t xml:space="preserve">.</w:t>
       </w:r>
     </w:p>
-    <w:bookmarkEnd w:id="21"/>
-    <w:bookmarkStart w:id="23" w:name="ref-Chinagorom2025"/>
+    <w:bookmarkEnd w:id="24"/>
+    <w:bookmarkStart w:id="26" w:name="ref-Chinagorom2025"/>
     <w:p>
       <w:pPr>
         <w:pStyle w:val="Bibliography"/>
@@ -2285,7 +2219,7 @@
       <w:r>
         <w:t xml:space="preserve"> </w:t>
       </w:r>
-      <w:hyperlink r:id="rId22">
+      <w:hyperlink r:id="rId25">
         <w:r>
           <w:rPr>
             <w:rStyle w:val="Hyperlink"/>
@@ -2297,8 +2231,8 @@
         <w:t xml:space="preserve">.</w:t>
       </w:r>
     </w:p>
-    <w:bookmarkEnd w:id="23"/>
-    <w:bookmarkStart w:id="25" w:name="ref-Dolatabadi2017"/>
+    <w:bookmarkEnd w:id="26"/>
+    <w:bookmarkStart w:id="28" w:name="ref-Dolatabadi2017"/>
     <w:p>
       <w:pPr>
         <w:pStyle w:val="Bibliography"/>
@@ -2328,7 +2262,7 @@
       <w:r>
         <w:t xml:space="preserve"> </w:t>
       </w:r>
-      <w:hyperlink r:id="rId24">
+      <w:hyperlink r:id="rId27">
         <w:r>
           <w:rPr>
             <w:rStyle w:val="Hyperlink"/>
@@ -2340,8 +2274,8 @@
         <w:t xml:space="preserve">.</w:t>
       </w:r>
     </w:p>
-    <w:bookmarkEnd w:id="25"/>
-    <w:bookmarkStart w:id="27" w:name="ref-Gowland1993"/>
+    <w:bookmarkEnd w:id="28"/>
+    <w:bookmarkStart w:id="30" w:name="ref-Gowland1993"/>
     <w:p>
       <w:pPr>
         <w:pStyle w:val="Bibliography"/>
@@ -2374,7 +2308,7 @@
       <w:r>
         <w:t xml:space="preserve"> </w:t>
       </w:r>
-      <w:hyperlink r:id="rId26">
+      <w:hyperlink r:id="rId29">
         <w:r>
           <w:rPr>
             <w:rStyle w:val="Hyperlink"/>
@@ -2386,8 +2320,8 @@
         <w:t xml:space="preserve">.</w:t>
       </w:r>
     </w:p>
-    <w:bookmarkEnd w:id="27"/>
-    <w:bookmarkStart w:id="29" w:name="ref-Hu2018"/>
+    <w:bookmarkEnd w:id="30"/>
+    <w:bookmarkStart w:id="32" w:name="ref-Hu2018"/>
     <w:p>
       <w:pPr>
         <w:pStyle w:val="Bibliography"/>
@@ -2417,7 +2351,7 @@
       <w:r>
         <w:t xml:space="preserve"> </w:t>
       </w:r>
-      <w:hyperlink r:id="rId28">
+      <w:hyperlink r:id="rId31">
         <w:r>
           <w:rPr>
             <w:rStyle w:val="Hyperlink"/>
@@ -2429,8 +2363,8 @@
         <w:t xml:space="preserve">.</w:t>
       </w:r>
     </w:p>
-    <w:bookmarkEnd w:id="29"/>
-    <w:bookmarkStart w:id="31" w:name="ref-JarqueBou2019"/>
+    <w:bookmarkEnd w:id="32"/>
+    <w:bookmarkStart w:id="34" w:name="ref-JarqueBou2019"/>
     <w:p>
       <w:pPr>
         <w:pStyle w:val="Bibliography"/>
@@ -2463,7 +2397,7 @@
       <w:r>
         <w:t xml:space="preserve"> </w:t>
       </w:r>
-      <w:hyperlink r:id="rId30">
+      <w:hyperlink r:id="rId33">
         <w:r>
           <w:rPr>
             <w:rStyle w:val="Hyperlink"/>
@@ -2475,8 +2409,8 @@
         <w:t xml:space="preserve">.</w:t>
       </w:r>
     </w:p>
-    <w:bookmarkEnd w:id="31"/>
-    <w:bookmarkStart w:id="33" w:name="ref-Kuriakose2020"/>
+    <w:bookmarkEnd w:id="34"/>
+    <w:bookmarkStart w:id="36" w:name="ref-Kuriakose2020"/>
     <w:p>
       <w:pPr>
         <w:pStyle w:val="Bibliography"/>
@@ -2509,7 +2443,7 @@
       <w:r>
         <w:t xml:space="preserve"> </w:t>
       </w:r>
-      <w:hyperlink r:id="rId32">
+      <w:hyperlink r:id="rId35">
         <w:r>
           <w:rPr>
             <w:rStyle w:val="Hyperlink"/>
@@ -2521,8 +2455,8 @@
         <w:t xml:space="preserve">.</w:t>
       </w:r>
     </w:p>
-    <w:bookmarkEnd w:id="33"/>
-    <w:bookmarkStart w:id="35" w:name="ref-Lin2019"/>
+    <w:bookmarkEnd w:id="36"/>
+    <w:bookmarkStart w:id="38" w:name="ref-Lin2019"/>
     <w:p>
       <w:pPr>
         <w:pStyle w:val="Bibliography"/>
@@ -2555,7 +2489,7 @@
       <w:r>
         <w:t xml:space="preserve"> </w:t>
       </w:r>
-      <w:hyperlink r:id="rId34">
+      <w:hyperlink r:id="rId37">
         <w:r>
           <w:rPr>
             <w:rStyle w:val="Hyperlink"/>
@@ -2567,8 +2501,8 @@
         <w:t xml:space="preserve">.</w:t>
       </w:r>
     </w:p>
-    <w:bookmarkEnd w:id="35"/>
-    <w:bookmarkStart w:id="37" w:name="ref-Lu2012"/>
+    <w:bookmarkEnd w:id="38"/>
+    <w:bookmarkStart w:id="40" w:name="ref-Lu2012"/>
     <w:p>
       <w:pPr>
         <w:pStyle w:val="Bibliography"/>
@@ -2601,7 +2535,7 @@
       <w:r>
         <w:t xml:space="preserve"> </w:t>
       </w:r>
-      <w:hyperlink r:id="rId36">
+      <w:hyperlink r:id="rId39">
         <w:r>
           <w:rPr>
             <w:rStyle w:val="Hyperlink"/>
@@ -2613,8 +2547,8 @@
         <w:t xml:space="preserve">.</w:t>
       </w:r>
     </w:p>
-    <w:bookmarkEnd w:id="37"/>
-    <w:bookmarkStart w:id="39" w:name="ref-Lucchetti2025"/>
+    <w:bookmarkEnd w:id="40"/>
+    <w:bookmarkStart w:id="42" w:name="ref-Lucchetti2025"/>
     <w:p>
       <w:pPr>
         <w:pStyle w:val="Bibliography"/>
@@ -2647,7 +2581,7 @@
       <w:r>
         <w:t xml:space="preserve"> </w:t>
       </w:r>
-      <w:hyperlink r:id="rId38">
+      <w:hyperlink r:id="rId41">
         <w:r>
           <w:rPr>
             <w:rStyle w:val="Hyperlink"/>
@@ -2659,8 +2593,8 @@
         <w:t xml:space="preserve">.</w:t>
       </w:r>
     </w:p>
-    <w:bookmarkEnd w:id="39"/>
-    <w:bookmarkStart w:id="41" w:name="ref-Mehrholz2015"/>
+    <w:bookmarkEnd w:id="42"/>
+    <w:bookmarkStart w:id="44" w:name="ref-Mehrholz2015"/>
     <w:p>
       <w:pPr>
         <w:pStyle w:val="Bibliography"/>
@@ -2690,7 +2624,7 @@
       <w:r>
         <w:t xml:space="preserve"> </w:t>
       </w:r>
-      <w:hyperlink r:id="rId40">
+      <w:hyperlink r:id="rId43">
         <w:r>
           <w:rPr>
             <w:rStyle w:val="Hyperlink"/>
@@ -2702,8 +2636,8 @@
         <w:t xml:space="preserve">.</w:t>
       </w:r>
     </w:p>
-    <w:bookmarkEnd w:id="41"/>
-    <w:bookmarkStart w:id="42" w:name="ref-OhuePythonUnpub"/>
+    <w:bookmarkEnd w:id="44"/>
+    <w:bookmarkStart w:id="45" w:name="ref-OhuePythonUnpub"/>
     <w:p>
       <w:pPr>
         <w:pStyle w:val="Bibliography"/>
@@ -2725,8 +2659,8 @@
         <w:t xml:space="preserve">.</w:t>
       </w:r>
     </w:p>
-    <w:bookmarkEnd w:id="42"/>
-    <w:bookmarkStart w:id="43" w:name="ref-Ohue2026"/>
+    <w:bookmarkEnd w:id="45"/>
+    <w:bookmarkStart w:id="46" w:name="ref-Ohue2026"/>
     <w:p>
       <w:pPr>
         <w:pStyle w:val="Bibliography"/>
@@ -2748,8 +2682,8 @@
         <w:t xml:space="preserve">.</w:t>
       </w:r>
     </w:p>
-    <w:bookmarkEnd w:id="43"/>
-    <w:bookmarkStart w:id="45" w:name="ref-Saudabayev2018"/>
+    <w:bookmarkEnd w:id="46"/>
+    <w:bookmarkStart w:id="48" w:name="ref-Saudabayev2018"/>
     <w:p>
       <w:pPr>
         <w:pStyle w:val="Bibliography"/>
@@ -2782,7 +2716,7 @@
       <w:r>
         <w:t xml:space="preserve"> </w:t>
       </w:r>
-      <w:hyperlink r:id="rId44">
+      <w:hyperlink r:id="rId47">
         <w:r>
           <w:rPr>
             <w:rStyle w:val="Hyperlink"/>
@@ -2794,8 +2728,8 @@
         <w:t xml:space="preserve">.</w:t>
       </w:r>
     </w:p>
-    <w:bookmarkEnd w:id="45"/>
-    <w:bookmarkStart w:id="46" w:name="ref-Schulman2017"/>
+    <w:bookmarkEnd w:id="48"/>
+    <w:bookmarkStart w:id="49" w:name="ref-Schulman2017"/>
     <w:p>
       <w:pPr>
         <w:pStyle w:val="Bibliography"/>
@@ -2823,8 +2757,8 @@
         <w:t xml:space="preserve">.</w:t>
       </w:r>
     </w:p>
-    <w:bookmarkEnd w:id="46"/>
-    <w:bookmarkStart w:id="48" w:name="ref-Sugawara2018"/>
+    <w:bookmarkEnd w:id="49"/>
+    <w:bookmarkStart w:id="51" w:name="ref-Sugawara2018"/>
     <w:p>
       <w:pPr>
         <w:pStyle w:val="Bibliography"/>
@@ -2857,7 +2791,7 @@
       <w:r>
         <w:t xml:space="preserve"> </w:t>
       </w:r>
-      <w:hyperlink r:id="rId47">
+      <w:hyperlink r:id="rId50">
         <w:r>
           <w:rPr>
             <w:rStyle w:val="Hyperlink"/>
@@ -2869,8 +2803,8 @@
         <w:t xml:space="preserve">.</w:t>
       </w:r>
     </w:p>
-    <w:bookmarkEnd w:id="48"/>
-    <w:bookmarkStart w:id="50" w:name="ref-Takeuchi2013"/>
+    <w:bookmarkEnd w:id="51"/>
+    <w:bookmarkStart w:id="53" w:name="ref-Takeuchi2013"/>
     <w:p>
       <w:pPr>
         <w:pStyle w:val="Bibliography"/>
@@ -2903,7 +2837,7 @@
       <w:r>
         <w:t xml:space="preserve"> </w:t>
       </w:r>
-      <w:hyperlink r:id="rId49">
+      <w:hyperlink r:id="rId52">
         <w:r>
           <w:rPr>
             <w:rStyle w:val="Hyperlink"/>
@@ -2915,8 +2849,8 @@
         <w:t xml:space="preserve">.</w:t>
       </w:r>
     </w:p>
-    <w:bookmarkEnd w:id="50"/>
-    <w:bookmarkStart w:id="52" w:name="ref-Zhi2018"/>
+    <w:bookmarkEnd w:id="53"/>
+    <w:bookmarkStart w:id="55" w:name="ref-Zhi2018"/>
     <w:p>
       <w:pPr>
         <w:pStyle w:val="Bibliography"/>
@@ -2949,7 +2883,7 @@
       <w:r>
         <w:t xml:space="preserve"> </w:t>
       </w:r>
-      <w:hyperlink r:id="rId51">
+      <w:hyperlink r:id="rId54">
         <w:r>
           <w:rPr>
             <w:rStyle w:val="Hyperlink"/>
@@ -2961,10 +2895,10 @@
         <w:t xml:space="preserve">.</w:t>
       </w:r>
     </w:p>
-    <w:bookmarkEnd w:id="52"/>
-    <w:bookmarkEnd w:id="53"/>
-    <w:bookmarkEnd w:id="54"/>
     <w:bookmarkEnd w:id="55"/>
+    <w:bookmarkEnd w:id="56"/>
+    <w:bookmarkEnd w:id="57"/>
+    <w:bookmarkEnd w:id="58"/>
     <w:sectPr>
       <w:footnotePr>
         <w:numRestart w:val="eachSect"/>

</xml_diff>

<commit_message>
Rebuild manuscript.docx with grounded Methodology
</commit_message>
<xml_diff>
--- a/paper/manuscript.docx
+++ b/paper/manuscript.docx
@@ -425,33 +425,375 @@
         <w:pStyle w:val="FirstParagraph"/>
       </w:pPr>
       <w:r>
-        <w:t xml:space="preserve">The RL controller is a PPO actor-critic agent trained in a 2-D point-mass reaching environment under Newtonian dynamics. Its state</w:t>
+        <w:t xml:space="preserve">The RL controller is a PPO actor-critic agent trained on a 2-D obstacle-avoidance reaching task, following the environment, reward function, and perturbation protocol of our companion paper</w:t>
+      </w:r>
+      <w:r>
+        <w:t xml:space="preserve"> </w:t>
+      </w:r>
+      <w:r>
+        <w:t xml:space="preserve">(Ohue et al. 2026)</w:t>
+      </w:r>
+      <w:r>
+        <w:t xml:space="preserve">. The agent is a point mass that receives continuous force commands and evolves under Newtonian dynamics inside a bounded rectangular workspace containing a fixed goal and two static obstacles forming a corridor. Its observation is expressed in agent-centred coordinates,</w:t>
+      </w:r>
+    </w:p>
+    <w:p>
+      <w:pPr>
+        <w:pStyle w:val="BodyText"/>
+      </w:pPr>
+      <m:oMathPara>
+        <m:oMathParaPr>
+          <m:jc m:val="center"/>
+        </m:oMathParaPr>
+        <m:oMath>
+          <m:sSub>
+            <m:e>
+              <m:r>
+                <m:rPr>
+                  <m:sty m:val="b"/>
+                </m:rPr>
+                <m:t>s</m:t>
+              </m:r>
+            </m:e>
+            <m:sub>
+              <m:r>
+                <m:t>t</m:t>
+              </m:r>
+            </m:sub>
+          </m:sSub>
+          <m:r>
+            <m:rPr>
+              <m:sty m:val="p"/>
+            </m:rPr>
+            <m:t>=</m:t>
+          </m:r>
+          <m:d>
+            <m:dPr>
+              <m:begChr m:val="["/>
+              <m:sepChr m:val=""/>
+              <m:endChr m:val="]"/>
+              <m:grow/>
+            </m:dPr>
+            <m:e>
+              <m:sSub>
+                <m:e>
+                  <m:r>
+                    <m:t>g</m:t>
+                  </m:r>
+                </m:e>
+                <m:sub>
+                  <m:r>
+                    <m:t>x</m:t>
+                  </m:r>
+                </m:sub>
+              </m:sSub>
+              <m:r>
+                <m:rPr>
+                  <m:sty m:val="p"/>
+                </m:rPr>
+                <m:t>−</m:t>
+              </m:r>
+              <m:sSub>
+                <m:e>
+                  <m:r>
+                    <m:t>x</m:t>
+                  </m:r>
+                </m:e>
+                <m:sub>
+                  <m:r>
+                    <m:t>t</m:t>
+                  </m:r>
+                </m:sub>
+              </m:sSub>
+              <m:r>
+                <m:rPr>
+                  <m:sty m:val="p"/>
+                </m:rPr>
+                <m:t>,</m:t>
+              </m:r>
+              <m:r>
+                <m:t> </m:t>
+              </m:r>
+              <m:sSub>
+                <m:e>
+                  <m:r>
+                    <m:t>g</m:t>
+                  </m:r>
+                </m:e>
+                <m:sub>
+                  <m:r>
+                    <m:t>y</m:t>
+                  </m:r>
+                </m:sub>
+              </m:sSub>
+              <m:r>
+                <m:rPr>
+                  <m:sty m:val="p"/>
+                </m:rPr>
+                <m:t>−</m:t>
+              </m:r>
+              <m:sSub>
+                <m:e>
+                  <m:r>
+                    <m:t>y</m:t>
+                  </m:r>
+                </m:e>
+                <m:sub>
+                  <m:r>
+                    <m:t>t</m:t>
+                  </m:r>
+                </m:sub>
+              </m:sSub>
+              <m:r>
+                <m:rPr>
+                  <m:sty m:val="p"/>
+                </m:rPr>
+                <m:t>,</m:t>
+              </m:r>
+              <m:r>
+                <m:t> </m:t>
+              </m:r>
+              <m:sSub>
+                <m:e>
+                  <m:r>
+                    <m:t>o</m:t>
+                  </m:r>
+                </m:e>
+                <m:sub>
+                  <m:r>
+                    <m:t>L</m:t>
+                  </m:r>
+                  <m:r>
+                    <m:t>x</m:t>
+                  </m:r>
+                </m:sub>
+              </m:sSub>
+              <m:r>
+                <m:rPr>
+                  <m:sty m:val="p"/>
+                </m:rPr>
+                <m:t>−</m:t>
+              </m:r>
+              <m:sSub>
+                <m:e>
+                  <m:r>
+                    <m:t>x</m:t>
+                  </m:r>
+                </m:e>
+                <m:sub>
+                  <m:r>
+                    <m:t>t</m:t>
+                  </m:r>
+                </m:sub>
+              </m:sSub>
+              <m:r>
+                <m:rPr>
+                  <m:sty m:val="p"/>
+                </m:rPr>
+                <m:t>,</m:t>
+              </m:r>
+              <m:r>
+                <m:t> </m:t>
+              </m:r>
+              <m:sSub>
+                <m:e>
+                  <m:r>
+                    <m:t>o</m:t>
+                  </m:r>
+                </m:e>
+                <m:sub>
+                  <m:r>
+                    <m:t>L</m:t>
+                  </m:r>
+                  <m:r>
+                    <m:t>y</m:t>
+                  </m:r>
+                </m:sub>
+              </m:sSub>
+              <m:r>
+                <m:rPr>
+                  <m:sty m:val="p"/>
+                </m:rPr>
+                <m:t>−</m:t>
+              </m:r>
+              <m:sSub>
+                <m:e>
+                  <m:r>
+                    <m:t>y</m:t>
+                  </m:r>
+                </m:e>
+                <m:sub>
+                  <m:r>
+                    <m:t>t</m:t>
+                  </m:r>
+                </m:sub>
+              </m:sSub>
+              <m:r>
+                <m:rPr>
+                  <m:sty m:val="p"/>
+                </m:rPr>
+                <m:t>,</m:t>
+              </m:r>
+              <m:r>
+                <m:t> </m:t>
+              </m:r>
+              <m:sSub>
+                <m:e>
+                  <m:r>
+                    <m:t>o</m:t>
+                  </m:r>
+                </m:e>
+                <m:sub>
+                  <m:r>
+                    <m:t>R</m:t>
+                  </m:r>
+                  <m:r>
+                    <m:t>x</m:t>
+                  </m:r>
+                </m:sub>
+              </m:sSub>
+              <m:r>
+                <m:rPr>
+                  <m:sty m:val="p"/>
+                </m:rPr>
+                <m:t>−</m:t>
+              </m:r>
+              <m:sSub>
+                <m:e>
+                  <m:r>
+                    <m:t>x</m:t>
+                  </m:r>
+                </m:e>
+                <m:sub>
+                  <m:r>
+                    <m:t>t</m:t>
+                  </m:r>
+                </m:sub>
+              </m:sSub>
+              <m:r>
+                <m:rPr>
+                  <m:sty m:val="p"/>
+                </m:rPr>
+                <m:t>,</m:t>
+              </m:r>
+              <m:r>
+                <m:t> </m:t>
+              </m:r>
+              <m:sSub>
+                <m:e>
+                  <m:r>
+                    <m:t>o</m:t>
+                  </m:r>
+                </m:e>
+                <m:sub>
+                  <m:r>
+                    <m:t>R</m:t>
+                  </m:r>
+                  <m:r>
+                    <m:t>y</m:t>
+                  </m:r>
+                </m:sub>
+              </m:sSub>
+              <m:r>
+                <m:rPr>
+                  <m:sty m:val="p"/>
+                </m:rPr>
+                <m:t>−</m:t>
+              </m:r>
+              <m:sSub>
+                <m:e>
+                  <m:r>
+                    <m:t>y</m:t>
+                  </m:r>
+                </m:e>
+                <m:sub>
+                  <m:r>
+                    <m:t>t</m:t>
+                  </m:r>
+                </m:sub>
+              </m:sSub>
+              <m:r>
+                <m:rPr>
+                  <m:sty m:val="p"/>
+                </m:rPr>
+                <m:t>,</m:t>
+              </m:r>
+              <m:r>
+                <m:t> </m:t>
+              </m:r>
+              <m:sSub>
+                <m:e>
+                  <m:r>
+                    <m:t>v</m:t>
+                  </m:r>
+                </m:e>
+                <m:sub>
+                  <m:r>
+                    <m:t>x</m:t>
+                  </m:r>
+                  <m:r>
+                    <m:rPr>
+                      <m:sty m:val="p"/>
+                    </m:rPr>
+                    <m:t>,</m:t>
+                  </m:r>
+                  <m:r>
+                    <m:t>t</m:t>
+                  </m:r>
+                </m:sub>
+              </m:sSub>
+              <m:r>
+                <m:rPr>
+                  <m:sty m:val="p"/>
+                </m:rPr>
+                <m:t>,</m:t>
+              </m:r>
+              <m:r>
+                <m:t> </m:t>
+              </m:r>
+              <m:sSub>
+                <m:e>
+                  <m:r>
+                    <m:t>v</m:t>
+                  </m:r>
+                </m:e>
+                <m:sub>
+                  <m:r>
+                    <m:t>y</m:t>
+                  </m:r>
+                  <m:r>
+                    <m:rPr>
+                      <m:sty m:val="p"/>
+                    </m:rPr>
+                    <m:t>,</m:t>
+                  </m:r>
+                  <m:r>
+                    <m:t>t</m:t>
+                  </m:r>
+                </m:sub>
+              </m:sSub>
+            </m:e>
+          </m:d>
+          <m:r>
+            <m:rPr>
+              <m:sty m:val="p"/>
+            </m:rPr>
+            <m:t>,</m:t>
+          </m:r>
+        </m:oMath>
+      </m:oMathPara>
+    </w:p>
+    <w:p>
+      <w:pPr>
+        <w:pStyle w:val="FirstParagraph"/>
+      </w:pPr>
+      <w:r>
+        <w:t xml:space="preserve">where</w:t>
       </w:r>
       <w:r>
         <w:t xml:space="preserve"> </w:t>
       </w:r>
       <m:oMath>
-        <m:sSub>
-          <m:e>
-            <m:r>
-              <m:rPr>
-                <m:sty m:val="b"/>
-              </m:rPr>
-              <m:t>s</m:t>
-            </m:r>
-          </m:e>
-          <m:sub>
-            <m:r>
-              <m:t>t</m:t>
-            </m:r>
-          </m:sub>
-        </m:sSub>
-        <m:r>
-          <m:rPr>
-            <m:sty m:val="p"/>
-          </m:rPr>
-          <m:t>=</m:t>
-        </m:r>
         <m:r>
           <m:rPr>
             <m:sty m:val="p"/>
@@ -492,22 +834,41 @@
           <m:rPr>
             <m:sty m:val="p"/>
           </m:rPr>
-          <m:t>,</m:t>
+          <m:t>)</m:t>
+        </m:r>
+      </m:oMath>
+      <w:r>
+        <w:t xml:space="preserve"> </w:t>
+      </w:r>
+      <w:r>
+        <w:t xml:space="preserve">and</w:t>
+      </w:r>
+      <w:r>
+        <w:t xml:space="preserve"> </w:t>
+      </w:r>
+      <m:oMath>
+        <m:r>
+          <m:rPr>
+            <m:sty m:val="p"/>
+          </m:rPr>
+          <m:t>(</m:t>
         </m:r>
         <m:sSub>
           <m:e>
-            <m:acc>
-              <m:accPr>
-                <m:chr m:val="̇"/>
-              </m:accPr>
-              <m:e>
-                <m:r>
-                  <m:t>x</m:t>
-                </m:r>
-              </m:e>
-            </m:acc>
+            <m:r>
+              <m:t>v</m:t>
+            </m:r>
           </m:e>
           <m:sub>
+            <m:r>
+              <m:t>x</m:t>
+            </m:r>
+            <m:r>
+              <m:rPr>
+                <m:sty m:val="p"/>
+              </m:rPr>
+              <m:t>,</m:t>
+            </m:r>
             <m:r>
               <m:t>t</m:t>
             </m:r>
@@ -521,18 +882,20 @@
         </m:r>
         <m:sSub>
           <m:e>
-            <m:acc>
-              <m:accPr>
-                <m:chr m:val="̇"/>
-              </m:accPr>
-              <m:e>
-                <m:r>
-                  <m:t>y</m:t>
-                </m:r>
-              </m:e>
-            </m:acc>
+            <m:r>
+              <m:t>v</m:t>
+            </m:r>
           </m:e>
           <m:sub>
+            <m:r>
+              <m:t>y</m:t>
+            </m:r>
+            <m:r>
+              <m:rPr>
+                <m:sty m:val="p"/>
+              </m:rPr>
+              <m:t>,</m:t>
+            </m:r>
             <m:r>
               <m:t>t</m:t>
             </m:r>
@@ -549,7 +912,113 @@
         <w:t xml:space="preserve"> </w:t>
       </w:r>
       <w:r>
-        <w:t xml:space="preserve">evolves under</w:t>
+        <w:t xml:space="preserve">are the agent’s position and velocity,</w:t>
+      </w:r>
+      <w:r>
+        <w:t xml:space="preserve"> </w:t>
+      </w:r>
+      <m:oMath>
+        <m:r>
+          <m:rPr>
+            <m:sty m:val="p"/>
+          </m:rPr>
+          <m:t>(</m:t>
+        </m:r>
+        <m:sSub>
+          <m:e>
+            <m:r>
+              <m:t>g</m:t>
+            </m:r>
+          </m:e>
+          <m:sub>
+            <m:r>
+              <m:t>x</m:t>
+            </m:r>
+          </m:sub>
+        </m:sSub>
+        <m:r>
+          <m:rPr>
+            <m:sty m:val="p"/>
+          </m:rPr>
+          <m:t>,</m:t>
+        </m:r>
+        <m:sSub>
+          <m:e>
+            <m:r>
+              <m:t>g</m:t>
+            </m:r>
+          </m:e>
+          <m:sub>
+            <m:r>
+              <m:t>y</m:t>
+            </m:r>
+          </m:sub>
+        </m:sSub>
+        <m:r>
+          <m:rPr>
+            <m:sty m:val="p"/>
+          </m:rPr>
+          <m:t>)</m:t>
+        </m:r>
+      </m:oMath>
+      <w:r>
+        <w:t xml:space="preserve"> </w:t>
+      </w:r>
+      <w:r>
+        <w:t xml:space="preserve">is the goal location, and</w:t>
+      </w:r>
+      <w:r>
+        <w:t xml:space="preserve"> </w:t>
+      </w:r>
+      <m:oMath>
+        <m:r>
+          <m:rPr>
+            <m:sty m:val="p"/>
+          </m:rPr>
+          <m:t>(</m:t>
+        </m:r>
+        <m:sSub>
+          <m:e>
+            <m:r>
+              <m:t>o</m:t>
+            </m:r>
+          </m:e>
+          <m:sub>
+            <m:r>
+              <m:t>L</m:t>
+            </m:r>
+          </m:sub>
+        </m:sSub>
+        <m:r>
+          <m:rPr>
+            <m:sty m:val="p"/>
+          </m:rPr>
+          <m:t>,</m:t>
+        </m:r>
+        <m:sSub>
+          <m:e>
+            <m:r>
+              <m:t>o</m:t>
+            </m:r>
+          </m:e>
+          <m:sub>
+            <m:r>
+              <m:t>R</m:t>
+            </m:r>
+          </m:sub>
+        </m:sSub>
+        <m:r>
+          <m:rPr>
+            <m:sty m:val="p"/>
+          </m:rPr>
+          <m:t>)</m:t>
+        </m:r>
+      </m:oMath>
+      <w:r>
+        <w:t xml:space="preserve"> </w:t>
+      </w:r>
+      <w:r>
+        <w:t xml:space="preserve">are the centres of the left and right obstacles. The reward at each timestep combines four terms,</w:t>
       </w:r>
     </w:p>
     <w:p>
@@ -563,19 +1032,9 @@
         <m:oMath>
           <m:sSub>
             <m:e>
-              <m:acc>
-                <m:accPr>
-                  <m:chr m:val="̇"/>
-                </m:accPr>
-                <m:e>
-                  <m:r>
-                    <m:rPr>
-                      <m:sty m:val="b"/>
-                    </m:rPr>
-                    <m:t>s</m:t>
-                  </m:r>
-                </m:e>
-              </m:acc>
+              <m:r>
+                <m:t>R</m:t>
+              </m:r>
             </m:e>
             <m:sub>
               <m:r>
@@ -589,22 +1048,135 @@
             </m:rPr>
             <m:t>=</m:t>
           </m:r>
-          <m:r>
-            <m:t>f</m:t>
-          </m:r>
+          <m:sSub>
+            <m:e>
+              <m:r>
+                <m:t>w</m:t>
+              </m:r>
+            </m:e>
+            <m:sub>
+              <m:r>
+                <m:t>p</m:t>
+              </m:r>
+            </m:sub>
+          </m:sSub>
           <m:r>
             <m:rPr>
               <m:sty m:val="p"/>
             </m:rPr>
-            <m:t>(</m:t>
+            <m:t>Δ</m:t>
           </m:r>
           <m:sSub>
             <m:e>
               <m:r>
+                <m:t>d</m:t>
+              </m:r>
+            </m:e>
+            <m:sub>
+              <m:r>
                 <m:rPr>
-                  <m:sty m:val="b"/>
+                  <m:nor/>
+                  <m:sty m:val="p"/>
                 </m:rPr>
+                <m:t>goal</m:t>
+              </m:r>
+            </m:sub>
+          </m:sSub>
+          <m:r>
+            <m:rPr>
+              <m:sty m:val="p"/>
+            </m:rPr>
+            <m:t>−</m:t>
+          </m:r>
+          <m:sSub>
+            <m:e>
+              <m:r>
+                <m:t>w</m:t>
+              </m:r>
+            </m:e>
+            <m:sub>
+              <m:r>
+                <m:t>v</m:t>
+              </m:r>
+            </m:sub>
+          </m:sSub>
+          <m:d>
+            <m:dPr>
+              <m:begChr m:val="‖"/>
+              <m:sepChr m:val=""/>
+              <m:endChr m:val="‖"/>
+              <m:grow/>
+            </m:dPr>
+            <m:e>
+              <m:sSub>
+                <m:e>
+                  <m:r>
+                    <m:rPr>
+                      <m:sty m:val="b"/>
+                    </m:rPr>
+                    <m:t>v</m:t>
+                  </m:r>
+                </m:e>
+                <m:sub>
+                  <m:r>
+                    <m:t>t</m:t>
+                  </m:r>
+                </m:sub>
+              </m:sSub>
+            </m:e>
+          </m:d>
+          <m:r>
+            <m:rPr>
+              <m:sty m:val="p"/>
+            </m:rPr>
+            <m:t>−</m:t>
+          </m:r>
+          <m:sSub>
+            <m:e>
+              <m:r>
+                <m:t>w</m:t>
+              </m:r>
+            </m:e>
+            <m:sub>
+              <m:r>
+                <m:t>c</m:t>
+              </m:r>
+            </m:sub>
+          </m:sSub>
+          <m:sSub>
+            <m:e>
+              <m:r>
+                <m:t>C</m:t>
+              </m:r>
+            </m:e>
+            <m:sub>
+              <m:r>
+                <m:t>t</m:t>
+              </m:r>
+            </m:sub>
+          </m:sSub>
+          <m:r>
+            <m:rPr>
+              <m:sty m:val="p"/>
+            </m:rPr>
+            <m:t>+</m:t>
+          </m:r>
+          <m:sSub>
+            <m:e>
+              <m:r>
+                <m:t>w</m:t>
+              </m:r>
+            </m:e>
+            <m:sub>
+              <m:r>
                 <m:t>s</m:t>
+              </m:r>
+            </m:sub>
+          </m:sSub>
+          <m:sSub>
+            <m:e>
+              <m:r>
+                <m:t>S</m:t>
               </m:r>
             </m:e>
             <m:sub>
@@ -619,329 +1191,6 @@
             </m:rPr>
             <m:t>,</m:t>
           </m:r>
-          <m:sSub>
-            <m:e>
-              <m:r>
-                <m:rPr>
-                  <m:sty m:val="b"/>
-                </m:rPr>
-                <m:t>a</m:t>
-              </m:r>
-            </m:e>
-            <m:sub>
-              <m:r>
-                <m:t>t</m:t>
-              </m:r>
-            </m:sub>
-          </m:sSub>
-          <m:r>
-            <m:rPr>
-              <m:sty m:val="p"/>
-            </m:rPr>
-            <m:t>)</m:t>
-          </m:r>
-          <m:r>
-            <m:rPr>
-              <m:sty m:val="p"/>
-            </m:rPr>
-            <m:t>=</m:t>
-          </m:r>
-          <m:d>
-            <m:dPr>
-              <m:begChr m:val="["/>
-              <m:sepChr m:val=""/>
-              <m:endChr m:val="]"/>
-              <m:grow/>
-            </m:dPr>
-            <m:e>
-              <m:m>
-                <m:mPr>
-                  <m:baseJc m:val="center"/>
-                  <m:plcHide m:val="on"/>
-                  <m:mcs>
-                    <m:mc>
-                      <m:mcPr>
-                        <m:mcJc m:val="center"/>
-                        <m:count m:val="1"/>
-                      </m:mcPr>
-                    </m:mc>
-                  </m:mcs>
-                </m:mPr>
-                <m:mr>
-                  <m:e>
-                    <m:sSub>
-                      <m:e>
-                        <m:acc>
-                          <m:accPr>
-                            <m:chr m:val="̇"/>
-                          </m:accPr>
-                          <m:e>
-                            <m:r>
-                              <m:t>x</m:t>
-                            </m:r>
-                          </m:e>
-                        </m:acc>
-                      </m:e>
-                      <m:sub>
-                        <m:r>
-                          <m:t>t</m:t>
-                        </m:r>
-                      </m:sub>
-                    </m:sSub>
-                  </m:e>
-                </m:mr>
-                <m:mr>
-                  <m:e>
-                    <m:sSub>
-                      <m:e>
-                        <m:acc>
-                          <m:accPr>
-                            <m:chr m:val="̇"/>
-                          </m:accPr>
-                          <m:e>
-                            <m:r>
-                              <m:t>y</m:t>
-                            </m:r>
-                          </m:e>
-                        </m:acc>
-                      </m:e>
-                      <m:sub>
-                        <m:r>
-                          <m:t>t</m:t>
-                        </m:r>
-                      </m:sub>
-                    </m:sSub>
-                  </m:e>
-                </m:mr>
-                <m:mr>
-                  <m:e>
-                    <m:f>
-                      <m:fPr>
-                        <m:type m:val="lin"/>
-                      </m:fPr>
-                      <m:num>
-                        <m:r>
-                          <m:t>1</m:t>
-                        </m:r>
-                      </m:num>
-                      <m:den>
-                        <m:r>
-                          <m:t>m</m:t>
-                        </m:r>
-                      </m:den>
-                    </m:f>
-                    <m:d>
-                      <m:dPr>
-                        <m:begChr m:val="("/>
-                        <m:sepChr m:val=""/>
-                        <m:endChr m:val=")"/>
-                        <m:grow/>
-                      </m:dPr>
-                      <m:e>
-                        <m:sSub>
-                          <m:e>
-                            <m:r>
-                              <m:t>F</m:t>
-                            </m:r>
-                          </m:e>
-                          <m:sub>
-                            <m:r>
-                              <m:t>x</m:t>
-                            </m:r>
-                          </m:sub>
-                        </m:sSub>
-                        <m:r>
-                          <m:rPr>
-                            <m:sty m:val="p"/>
-                          </m:rPr>
-                          <m:t>(</m:t>
-                        </m:r>
-                        <m:sSub>
-                          <m:e>
-                            <m:r>
-                              <m:rPr>
-                                <m:sty m:val="b"/>
-                              </m:rPr>
-                              <m:t>a</m:t>
-                            </m:r>
-                          </m:e>
-                          <m:sub>
-                            <m:r>
-                              <m:t>t</m:t>
-                            </m:r>
-                          </m:sub>
-                        </m:sSub>
-                        <m:r>
-                          <m:rPr>
-                            <m:sty m:val="p"/>
-                          </m:rPr>
-                          <m:t>)</m:t>
-                        </m:r>
-                        <m:r>
-                          <m:rPr>
-                            <m:sty m:val="p"/>
-                          </m:rPr>
-                          <m:t>+</m:t>
-                        </m:r>
-                        <m:sSubSup>
-                          <m:e>
-                            <m:r>
-                              <m:t>F</m:t>
-                            </m:r>
-                          </m:e>
-                          <m:sub>
-                            <m:r>
-                              <m:t>x</m:t>
-                            </m:r>
-                          </m:sub>
-                          <m:sup>
-                            <m:r>
-                              <m:rPr>
-                                <m:nor/>
-                                <m:sty m:val="p"/>
-                              </m:rPr>
-                              <m:t>pert</m:t>
-                            </m:r>
-                          </m:sup>
-                        </m:sSubSup>
-                        <m:r>
-                          <m:rPr>
-                            <m:sty m:val="p"/>
-                          </m:rPr>
-                          <m:t>(</m:t>
-                        </m:r>
-                        <m:r>
-                          <m:t>t</m:t>
-                        </m:r>
-                        <m:r>
-                          <m:rPr>
-                            <m:sty m:val="p"/>
-                          </m:rPr>
-                          <m:t>)</m:t>
-                        </m:r>
-                      </m:e>
-                    </m:d>
-                  </m:e>
-                </m:mr>
-                <m:mr>
-                  <m:e>
-                    <m:f>
-                      <m:fPr>
-                        <m:type m:val="lin"/>
-                      </m:fPr>
-                      <m:num>
-                        <m:r>
-                          <m:t>1</m:t>
-                        </m:r>
-                      </m:num>
-                      <m:den>
-                        <m:r>
-                          <m:t>m</m:t>
-                        </m:r>
-                      </m:den>
-                    </m:f>
-                    <m:d>
-                      <m:dPr>
-                        <m:begChr m:val="("/>
-                        <m:sepChr m:val=""/>
-                        <m:endChr m:val=")"/>
-                        <m:grow/>
-                      </m:dPr>
-                      <m:e>
-                        <m:sSub>
-                          <m:e>
-                            <m:r>
-                              <m:t>F</m:t>
-                            </m:r>
-                          </m:e>
-                          <m:sub>
-                            <m:r>
-                              <m:t>y</m:t>
-                            </m:r>
-                          </m:sub>
-                        </m:sSub>
-                        <m:r>
-                          <m:rPr>
-                            <m:sty m:val="p"/>
-                          </m:rPr>
-                          <m:t>(</m:t>
-                        </m:r>
-                        <m:sSub>
-                          <m:e>
-                            <m:r>
-                              <m:rPr>
-                                <m:sty m:val="b"/>
-                              </m:rPr>
-                              <m:t>a</m:t>
-                            </m:r>
-                          </m:e>
-                          <m:sub>
-                            <m:r>
-                              <m:t>t</m:t>
-                            </m:r>
-                          </m:sub>
-                        </m:sSub>
-                        <m:r>
-                          <m:rPr>
-                            <m:sty m:val="p"/>
-                          </m:rPr>
-                          <m:t>)</m:t>
-                        </m:r>
-                        <m:r>
-                          <m:rPr>
-                            <m:sty m:val="p"/>
-                          </m:rPr>
-                          <m:t>+</m:t>
-                        </m:r>
-                        <m:sSubSup>
-                          <m:e>
-                            <m:r>
-                              <m:t>F</m:t>
-                            </m:r>
-                          </m:e>
-                          <m:sub>
-                            <m:r>
-                              <m:t>y</m:t>
-                            </m:r>
-                          </m:sub>
-                          <m:sup>
-                            <m:r>
-                              <m:rPr>
-                                <m:nor/>
-                                <m:sty m:val="p"/>
-                              </m:rPr>
-                              <m:t>pert</m:t>
-                            </m:r>
-                          </m:sup>
-                        </m:sSubSup>
-                        <m:r>
-                          <m:rPr>
-                            <m:sty m:val="p"/>
-                          </m:rPr>
-                          <m:t>(</m:t>
-                        </m:r>
-                        <m:r>
-                          <m:t>t</m:t>
-                        </m:r>
-                        <m:r>
-                          <m:rPr>
-                            <m:sty m:val="p"/>
-                          </m:rPr>
-                          <m:t>)</m:t>
-                        </m:r>
-                      </m:e>
-                    </m:d>
-                  </m:e>
-                </m:mr>
-              </m:m>
-            </m:e>
-          </m:d>
-          <m:r>
-            <m:rPr>
-              <m:sty m:val="p"/>
-            </m:rPr>
-            <m:t>,</m:t>
-          </m:r>
         </m:oMath>
       </m:oMathPara>
     </w:p>
@@ -950,19 +1199,13 @@
         <w:pStyle w:val="FirstParagraph"/>
       </w:pPr>
       <w:r>
-        <w:t xml:space="preserve">where</w:t>
-      </w:r>
-      <w:r>
-        <w:t xml:space="preserve"> </w:t>
+        <w:t xml:space="preserve">rewarding progress toward the goal, penalising excessive speed, penalising collision (</w:t>
       </w:r>
       <m:oMath>
         <m:sSub>
           <m:e>
             <m:r>
-              <m:rPr>
-                <m:sty m:val="b"/>
-              </m:rPr>
-              <m:t>a</m:t>
+              <m:t>C</m:t>
             </m:r>
           </m:e>
           <m:sub>
@@ -971,68 +1214,50 @@
             </m:r>
           </m:sub>
         </m:sSub>
-      </m:oMath>
-      <w:r>
-        <w:t xml:space="preserve"> </w:t>
-      </w:r>
-      <w:r>
-        <w:t xml:space="preserve">is the policy’s continuous control action,</w:t>
-      </w:r>
-      <w:r>
-        <w:t xml:space="preserve"> </w:t>
-      </w:r>
-      <m:oMath>
-        <m:r>
-          <m:t>m</m:t>
-        </m:r>
-      </m:oMath>
-      <w:r>
-        <w:t xml:space="preserve"> </w:t>
-      </w:r>
-      <w:r>
-        <w:t xml:space="preserve">is the point-mass, and</w:t>
-      </w:r>
-      <w:r>
-        <w:t xml:space="preserve"> </w:t>
-      </w:r>
-      <m:oMath>
-        <m:sSup>
-          <m:e>
-            <m:r>
-              <m:t>F</m:t>
-            </m:r>
-          </m:e>
-          <m:sup>
-            <m:r>
-              <m:rPr>
-                <m:nor/>
-                <m:sty m:val="p"/>
-              </m:rPr>
-              <m:t>pert</m:t>
-            </m:r>
-          </m:sup>
-        </m:sSup>
         <m:r>
           <m:rPr>
             <m:sty m:val="p"/>
           </m:rPr>
-          <m:t>(</m:t>
+          <m:t>=</m:t>
         </m:r>
         <m:r>
-          <m:t>t</m:t>
+          <m:t>1</m:t>
         </m:r>
+      </m:oMath>
+      <w:r>
+        <w:t xml:space="preserve"> </w:t>
+      </w:r>
+      <w:r>
+        <w:t xml:space="preserve">on collision), and rewarding successful goal attainment (</w:t>
+      </w:r>
+      <m:oMath>
+        <m:sSub>
+          <m:e>
+            <m:r>
+              <m:t>S</m:t>
+            </m:r>
+          </m:e>
+          <m:sub>
+            <m:r>
+              <m:t>t</m:t>
+            </m:r>
+          </m:sub>
+        </m:sSub>
         <m:r>
           <m:rPr>
             <m:sty m:val="p"/>
           </m:rPr>
-          <m:t>)</m:t>
+          <m:t>=</m:t>
+        </m:r>
+        <m:r>
+          <m:t>1</m:t>
         </m:r>
       </m:oMath>
       <w:r>
         <w:t xml:space="preserve"> </w:t>
       </w:r>
       <w:r>
-        <w:t xml:space="preserve">is a graded lateral force impulse applied during a fixed perturbation window. Policy and value networks are two-hidden-layer (256-unit) feedforward networks, trained with the clipped PPO surrogate objective</w:t>
+        <w:t xml:space="preserve">on success). Policy and value networks are separate two-hidden-layer (256-unit, ReLU) feedforward MLPs, trained with the clipped PPO surrogate objective</w:t>
       </w:r>
     </w:p>
     <w:p>
@@ -1474,7 +1699,7 @@
             <m:rPr>
               <m:sty m:val="p"/>
             </m:rPr>
-            <m:t>.</m:t>
+            <m:t>,</m:t>
           </m:r>
         </m:oMath>
       </m:oMathPara>
@@ -1484,7 +1709,410 @@
         <w:pStyle w:val="FirstParagraph"/>
       </w:pPr>
       <w:r>
-        <w:t xml:space="preserve">We treat the trained policy’s rollouts under each perturbation condition (P0 control; L1–L3, R1–R3 graded lateral perturbations) as reference trajectories: task-optimal movement paths, unconstrained by anatomy, against which human reach geometry can be compared for compensation.</w:t>
+        <w:t xml:space="preserve">using Stable-Baselines3 with clip parameter</w:t>
+      </w:r>
+      <w:r>
+        <w:t xml:space="preserve"> </w:t>
+      </w:r>
+      <m:oMath>
+        <m:r>
+          <m:t>ϵ</m:t>
+        </m:r>
+        <m:r>
+          <m:rPr>
+            <m:sty m:val="p"/>
+          </m:rPr>
+          <m:t>=</m:t>
+        </m:r>
+        <m:r>
+          <m:t>0.2</m:t>
+        </m:r>
+      </m:oMath>
+      <w:r>
+        <w:t xml:space="preserve">, learning rate</w:t>
+      </w:r>
+      <w:r>
+        <w:t xml:space="preserve"> </w:t>
+      </w:r>
+      <m:oMath>
+        <m:r>
+          <m:t>3</m:t>
+        </m:r>
+        <m:r>
+          <m:rPr>
+            <m:sty m:val="p"/>
+          </m:rPr>
+          <m:t>×</m:t>
+        </m:r>
+        <m:sSup>
+          <m:e>
+            <m:r>
+              <m:t>10</m:t>
+            </m:r>
+          </m:e>
+          <m:sup>
+            <m:r>
+              <m:rPr>
+                <m:sty m:val="p"/>
+              </m:rPr>
+              <m:t>−</m:t>
+            </m:r>
+            <m:r>
+              <m:t>4</m:t>
+            </m:r>
+          </m:sup>
+        </m:sSup>
+      </m:oMath>
+      <w:r>
+        <w:t xml:space="preserve">, discount</w:t>
+      </w:r>
+      <w:r>
+        <w:t xml:space="preserve"> </w:t>
+      </w:r>
+      <m:oMath>
+        <m:r>
+          <m:t>γ</m:t>
+        </m:r>
+        <m:r>
+          <m:rPr>
+            <m:sty m:val="p"/>
+          </m:rPr>
+          <m:t>=</m:t>
+        </m:r>
+        <m:r>
+          <m:t>0.99</m:t>
+        </m:r>
+      </m:oMath>
+      <w:r>
+        <w:t xml:space="preserve">, GAE parameter</w:t>
+      </w:r>
+      <w:r>
+        <w:t xml:space="preserve"> </w:t>
+      </w:r>
+      <m:oMath>
+        <m:r>
+          <m:t>λ</m:t>
+        </m:r>
+        <m:r>
+          <m:rPr>
+            <m:sty m:val="p"/>
+          </m:rPr>
+          <m:t>=</m:t>
+        </m:r>
+        <m:r>
+          <m:t>0.95</m:t>
+        </m:r>
+      </m:oMath>
+      <w:r>
+        <w:t xml:space="preserve">, value-loss coefficient 0.5, and maximum gradient norm 0.5, for</w:t>
+      </w:r>
+      <w:r>
+        <w:t xml:space="preserve"> </w:t>
+      </w:r>
+      <m:oMath>
+        <m:r>
+          <m:t>3</m:t>
+        </m:r>
+        <m:r>
+          <m:rPr>
+            <m:sty m:val="p"/>
+          </m:rPr>
+          <m:t>×</m:t>
+        </m:r>
+        <m:sSup>
+          <m:e>
+            <m:r>
+              <m:t>10</m:t>
+            </m:r>
+          </m:e>
+          <m:sup>
+            <m:r>
+              <m:t>6</m:t>
+            </m:r>
+          </m:sup>
+        </m:sSup>
+      </m:oMath>
+      <w:r>
+        <w:t xml:space="preserve"> </w:t>
+      </w:r>
+      <w:r>
+        <w:t xml:space="preserve">environment timesteps (</w:t>
+      </w:r>
+      <w:r>
+        <w:rPr>
+          <w:rStyle w:val="VerbatimChar"/>
+        </w:rPr>
+        <w:t xml:space="preserve">configs/training.yaml</w:t>
+      </w:r>
+      <w:r>
+        <w:t xml:space="preserve">)</w:t>
+      </w:r>
+      <w:r>
+        <w:t xml:space="preserve"> </w:t>
+      </w:r>
+      <w:r>
+        <w:t xml:space="preserve">(Schulman et al. 2017)</w:t>
+      </w:r>
+      <w:r>
+        <w:t xml:space="preserve">.</w:t>
+      </w:r>
+      <w:r>
+        <w:t xml:space="preserve"> </w:t>
+      </w:r>
+      <w:r>
+        <w:rPr>
+          <w:i/>
+          <w:iCs/>
+        </w:rPr>
+        <w:t xml:space="preserve">[Note: this repository’s</w:t>
+      </w:r>
+      <w:r>
+        <w:rPr>
+          <w:i/>
+          <w:iCs/>
+        </w:rPr>
+        <w:t xml:space="preserve"> </w:t>
+      </w:r>
+      <w:r>
+        <w:rPr>
+          <w:rStyle w:val="VerbatimChar"/>
+          <w:i/>
+          <w:iCs/>
+        </w:rPr>
+        <w:t xml:space="preserve">ent_coef</w:t>
+      </w:r>
+      <w:r>
+        <w:rPr>
+          <w:i/>
+          <w:iCs/>
+        </w:rPr>
+        <w:t xml:space="preserve"> </w:t>
+      </w:r>
+      <w:r>
+        <w:rPr>
+          <w:i/>
+          <w:iCs/>
+        </w:rPr>
+        <w:t xml:space="preserve">is 0.01; the companion paper reports 0.005 for the same hyperparameter – confirm which value the reference policy should use before final submission.]</w:t>
+      </w:r>
+    </w:p>
+    <w:p>
+      <w:pPr>
+        <w:pStyle w:val="BodyText"/>
+      </w:pPr>
+      <w:r>
+        <w:t xml:space="preserve">To probe online correction, a transient lateral force impulse is applied for six timesteps starting at</w:t>
+      </w:r>
+      <w:r>
+        <w:t xml:space="preserve"> </w:t>
+      </w:r>
+      <m:oMath>
+        <m:r>
+          <m:t>t</m:t>
+        </m:r>
+        <m:r>
+          <m:rPr>
+            <m:sty m:val="p"/>
+          </m:rPr>
+          <m:t>=</m:t>
+        </m:r>
+        <m:r>
+          <m:t>50</m:t>
+        </m:r>
+      </m:oMath>
+      <w:r>
+        <w:t xml:space="preserve">:</w:t>
+      </w:r>
+    </w:p>
+    <w:p>
+      <w:pPr>
+        <w:pStyle w:val="BodyText"/>
+      </w:pPr>
+      <m:oMathPara>
+        <m:oMathParaPr>
+          <m:jc m:val="center"/>
+        </m:oMathParaPr>
+        <m:oMath>
+          <m:sSub>
+            <m:e>
+              <m:r>
+                <m:t>f</m:t>
+              </m:r>
+            </m:e>
+            <m:sub>
+              <m:r>
+                <m:t>x</m:t>
+              </m:r>
+            </m:sub>
+          </m:sSub>
+          <m:r>
+            <m:rPr>
+              <m:sty m:val="p"/>
+            </m:rPr>
+            <m:t>(</m:t>
+          </m:r>
+          <m:r>
+            <m:t>t</m:t>
+          </m:r>
+          <m:r>
+            <m:rPr>
+              <m:sty m:val="p"/>
+            </m:rPr>
+            <m:t>)</m:t>
+          </m:r>
+          <m:r>
+            <m:rPr>
+              <m:sty m:val="p"/>
+            </m:rPr>
+            <m:t>=</m:t>
+          </m:r>
+          <m:sSub>
+            <m:e>
+              <m:r>
+                <m:t>p</m:t>
+              </m:r>
+            </m:e>
+            <m:sub>
+              <m:r>
+                <m:t>i</m:t>
+              </m:r>
+            </m:sub>
+          </m:sSub>
+          <m:r>
+            <m:rPr>
+              <m:sty m:val="p"/>
+            </m:rPr>
+            <m:t>,</m:t>
+          </m:r>
+          <m:r>
+            <m:t> </m:t>
+          </m:r>
+          <m:r>
+            <m:t>t</m:t>
+          </m:r>
+          <m:r>
+            <m:rPr>
+              <m:sty m:val="p"/>
+            </m:rPr>
+            <m:t>∈</m:t>
+          </m:r>
+          <m:r>
+            <m:rPr>
+              <m:sty m:val="p"/>
+            </m:rPr>
+            <m:t>[</m:t>
+          </m:r>
+          <m:r>
+            <m:t>50</m:t>
+          </m:r>
+          <m:r>
+            <m:rPr>
+              <m:sty m:val="p"/>
+            </m:rPr>
+            <m:t>,</m:t>
+          </m:r>
+          <m:r>
+            <m:t>55</m:t>
+          </m:r>
+          <m:r>
+            <m:rPr>
+              <m:sty m:val="p"/>
+            </m:rPr>
+            <m:t>]</m:t>
+          </m:r>
+          <m:r>
+            <m:rPr>
+              <m:sty m:val="p"/>
+            </m:rPr>
+            <m:t>,</m:t>
+          </m:r>
+          <m:r>
+            <m:t> </m:t>
+          </m:r>
+          <m:sSub>
+            <m:e>
+              <m:r>
+                <m:t>p</m:t>
+              </m:r>
+            </m:e>
+            <m:sub>
+              <m:r>
+                <m:t>i</m:t>
+              </m:r>
+            </m:sub>
+          </m:sSub>
+          <m:r>
+            <m:rPr>
+              <m:sty m:val="p"/>
+            </m:rPr>
+            <m:t>∈</m:t>
+          </m:r>
+          <m:r>
+            <m:rPr>
+              <m:sty m:val="p"/>
+            </m:rPr>
+            <m:t>{</m:t>
+          </m:r>
+          <m:r>
+            <m:rPr>
+              <m:sty m:val="p"/>
+            </m:rPr>
+            <m:t>±</m:t>
+          </m:r>
+          <m:r>
+            <m:t>0.15</m:t>
+          </m:r>
+          <m:r>
+            <m:rPr>
+              <m:sty m:val="p"/>
+            </m:rPr>
+            <m:t>,</m:t>
+          </m:r>
+          <m:r>
+            <m:rPr>
+              <m:sty m:val="p"/>
+            </m:rPr>
+            <m:t>±</m:t>
+          </m:r>
+          <m:r>
+            <m:t>0.30</m:t>
+          </m:r>
+          <m:r>
+            <m:rPr>
+              <m:sty m:val="p"/>
+            </m:rPr>
+            <m:t>,</m:t>
+          </m:r>
+          <m:r>
+            <m:rPr>
+              <m:sty m:val="p"/>
+            </m:rPr>
+            <m:t>±</m:t>
+          </m:r>
+          <m:r>
+            <m:t>0.45</m:t>
+          </m:r>
+          <m:r>
+            <m:rPr>
+              <m:sty m:val="p"/>
+            </m:rPr>
+            <m:t>}</m:t>
+          </m:r>
+          <m:r>
+            <m:rPr>
+              <m:sty m:val="p"/>
+            </m:rPr>
+            <m:t>,</m:t>
+          </m:r>
+        </m:oMath>
+      </m:oMathPara>
+    </w:p>
+    <w:p>
+      <w:pPr>
+        <w:pStyle w:val="FirstParagraph"/>
+      </w:pPr>
+      <w:r>
+        <w:t xml:space="preserve">giving seven evaluation conditions: an unperturbed control (P0), three leftward magnitudes (L1-L3), and three rightward magnitudes (R1-R3). We treat the trained policy’s rollouts under each condition as reference trajectories: task-optimal movement paths, unconstrained by anatomy, against which human reach geometry can be compared for compensation.</w:t>
       </w:r>
     </w:p>
     <w:bookmarkEnd w:id="15"/>

</xml_diff>